<commit_message>
SEQUOIADBMAINSTREAM-2071 File类 新增文件 远程copy功能 更新文档
git-svn-id: http://192.168.20.11/sequoiadb/trunk@28219 6121f079-4a18-41d3-8c30-8870a322f2c2
</commit_message>
<xml_diff>
--- a/internal_doc/03.开发设计/JS对象增强和远程化-File远程拷贝push和pull功能.docx
+++ b/internal_doc/03.开发设计/JS对象增强和远程化-File远程拷贝push和pull功能.docx
@@ -487,6 +487,9 @@
     <w:p>
       <w:pPr>
         <w:pStyle w:val="Heading2"/>
+        <w:rPr>
+          <w:rFonts w:hint="eastAsia"/>
+        </w:rPr>
       </w:pPr>
       <w:r>
         <w:rPr>
@@ -509,7 +512,13 @@
     </w:p>
     <w:p>
       <w:pPr>
-        <w:ind w:leftChars="100" w:left="210"/>
+        <w:rPr>
+          <w:rFonts w:hint="eastAsia"/>
+        </w:rPr>
+      </w:pPr>
+    </w:p>
+    <w:p>
+      <w:pPr>
         <w:rPr>
           <w:b/>
           <w:sz w:val="28"/>
@@ -523,7 +532,7 @@
           <w:sz w:val="28"/>
           <w:szCs w:val="28"/>
         </w:rPr>
-        <w:t>新增</w:t>
+        <w:t>新增类</w:t>
       </w:r>
       <w:r>
         <w:rPr>
@@ -532,7 +541,16 @@
           <w:sz w:val="28"/>
           <w:szCs w:val="28"/>
         </w:rPr>
-        <w:t>函数</w:t>
+        <w:t>FileContent</w:t>
+      </w:r>
+      <w:r>
+        <w:rPr>
+          <w:rFonts w:hint="eastAsia"/>
+          <w:b/>
+          <w:sz w:val="28"/>
+          <w:szCs w:val="28"/>
+        </w:rPr>
+        <w:t>：用于存储文件二进制内容</w:t>
       </w:r>
     </w:p>
     <w:tbl>
@@ -652,37 +670,7 @@
               <w:rPr>
                 <w:rFonts w:hint="eastAsia"/>
               </w:rPr>
-              <w:t>push(</w:t>
-            </w:r>
-            <w:r>
-              <w:rPr>
-                <w:rFonts w:hint="eastAsia"/>
-              </w:rPr>
-              <w:t xml:space="preserve"> </w:t>
-            </w:r>
-            <w:r>
-              <w:rPr>
-                <w:rFonts w:hint="eastAsia"/>
-              </w:rPr>
-              <w:t>srcFile</w:t>
-            </w:r>
-            <w:r>
-              <w:rPr>
-                <w:rFonts w:hint="eastAsia"/>
-              </w:rPr>
-              <w:t>, dst</w:t>
-            </w:r>
-            <w:r>
-              <w:rPr>
-                <w:rFonts w:hint="eastAsia"/>
-              </w:rPr>
-              <w:t>File</w:t>
-            </w:r>
-            <w:r>
-              <w:rPr>
-                <w:rFonts w:hint="eastAsia"/>
-              </w:rPr>
-              <w:t>, [isReplace], [mode] )</w:t>
+              <w:t>toBase64Code()</w:t>
             </w:r>
           </w:p>
         </w:tc>
@@ -698,7 +686,19 @@
               <w:rPr>
                 <w:rFonts w:hint="eastAsia"/>
               </w:rPr>
-              <w:t>从本地主机拷贝文件到远程主机</w:t>
+              <w:t>将二进制流转化为</w:t>
+            </w:r>
+            <w:r>
+              <w:rPr>
+                <w:rFonts w:hint="eastAsia"/>
+              </w:rPr>
+              <w:t>base64</w:t>
+            </w:r>
+            <w:r>
+              <w:rPr>
+                <w:rFonts w:hint="eastAsia"/>
+              </w:rPr>
+              <w:t>编码输出</w:t>
             </w:r>
           </w:p>
         </w:tc>
@@ -710,81 +710,6 @@
             <w:pPr>
               <w:ind w:left="34"/>
             </w:pPr>
-            <w:r>
-              <w:rPr>
-                <w:rFonts w:hint="eastAsia"/>
-              </w:rPr>
-              <w:t xml:space="preserve">- </w:t>
-            </w:r>
-            <w:r>
-              <w:rPr>
-                <w:rFonts w:hint="eastAsia"/>
-              </w:rPr>
-              <w:t>srcFile</w:t>
-            </w:r>
-            <w:r>
-              <w:rPr>
-                <w:rFonts w:hint="eastAsia"/>
-              </w:rPr>
-              <w:t>本地主机源路径</w:t>
-            </w:r>
-          </w:p>
-          <w:p>
-            <w:pPr>
-              <w:ind w:left="34"/>
-            </w:pPr>
-            <w:r>
-              <w:rPr>
-                <w:rFonts w:hint="eastAsia"/>
-              </w:rPr>
-              <w:t xml:space="preserve">- </w:t>
-            </w:r>
-            <w:r>
-              <w:rPr>
-                <w:rFonts w:hint="eastAsia"/>
-              </w:rPr>
-              <w:t>dstFile</w:t>
-            </w:r>
-            <w:r>
-              <w:rPr>
-                <w:rFonts w:hint="eastAsia"/>
-              </w:rPr>
-              <w:t>远程主机目的路径</w:t>
-            </w:r>
-          </w:p>
-          <w:p>
-            <w:pPr>
-              <w:ind w:left="34"/>
-            </w:pPr>
-            <w:r>
-              <w:rPr>
-                <w:rFonts w:hint="eastAsia"/>
-              </w:rPr>
-              <w:t xml:space="preserve">-[isReplace] </w:t>
-            </w:r>
-            <w:r>
-              <w:rPr>
-                <w:rFonts w:hint="eastAsia"/>
-              </w:rPr>
-              <w:t>目的路径已存在时是否替代</w:t>
-            </w:r>
-          </w:p>
-          <w:p>
-            <w:pPr>
-              <w:ind w:left="34"/>
-            </w:pPr>
-            <w:r>
-              <w:rPr>
-                <w:rFonts w:hint="eastAsia"/>
-              </w:rPr>
-              <w:t xml:space="preserve">-[mode] </w:t>
-            </w:r>
-            <w:r>
-              <w:rPr>
-                <w:rFonts w:hint="eastAsia"/>
-              </w:rPr>
-              <w:t>文件权限</w:t>
-            </w:r>
           </w:p>
         </w:tc>
         <w:tc>
@@ -796,18 +721,18 @@
               <w:ind w:left="0"/>
             </w:pPr>
             <w:r>
-              <w:rPr>
-                <w:rFonts w:hint="eastAsia"/>
-              </w:rPr>
-              <w:t>无</w:t>
+              <w:t>S</w:t>
+            </w:r>
+            <w:r>
+              <w:rPr>
+                <w:rFonts w:hint="eastAsia"/>
+              </w:rPr>
+              <w:t>trng</w:t>
             </w:r>
           </w:p>
         </w:tc>
       </w:tr>
       <w:tr>
-        <w:trPr>
-          <w:trHeight w:val="892"/>
-        </w:trPr>
         <w:tc>
           <w:tcPr>
             <w:tcW w:w="3232" w:type="dxa"/>
@@ -820,31 +745,7 @@
               <w:rPr>
                 <w:rFonts w:hint="eastAsia"/>
               </w:rPr>
-              <w:t>pull(</w:t>
-            </w:r>
-            <w:r>
-              <w:rPr>
-                <w:rFonts w:hint="eastAsia"/>
-              </w:rPr>
-              <w:t>srcFile</w:t>
-            </w:r>
-            <w:r>
-              <w:rPr>
-                <w:rFonts w:hint="eastAsia"/>
-              </w:rPr>
-              <w:t xml:space="preserve">, </w:t>
-            </w:r>
-            <w:r>
-              <w:rPr>
-                <w:rFonts w:hint="eastAsia"/>
-              </w:rPr>
-              <w:t>dstFile</w:t>
-            </w:r>
-            <w:r>
-              <w:rPr>
-                <w:rFonts w:hint="eastAsia"/>
-              </w:rPr>
-              <w:t>, [isReplace], [mode] )</w:t>
+              <w:t>getLength()</w:t>
             </w:r>
           </w:p>
         </w:tc>
@@ -860,7 +761,19 @@
               <w:rPr>
                 <w:rFonts w:hint="eastAsia"/>
               </w:rPr>
-              <w:t>从远程主机拷贝文件到本地主机</w:t>
+              <w:t>获取</w:t>
+            </w:r>
+            <w:r>
+              <w:rPr>
+                <w:rFonts w:hint="eastAsia"/>
+              </w:rPr>
+              <w:t>内容</w:t>
+            </w:r>
+            <w:r>
+              <w:rPr>
+                <w:rFonts w:hint="eastAsia"/>
+              </w:rPr>
+              <w:t>长度</w:t>
             </w:r>
           </w:p>
         </w:tc>
@@ -872,81 +785,6 @@
             <w:pPr>
               <w:ind w:left="34"/>
             </w:pPr>
-            <w:r>
-              <w:rPr>
-                <w:rFonts w:hint="eastAsia"/>
-              </w:rPr>
-              <w:t xml:space="preserve">- </w:t>
-            </w:r>
-            <w:r>
-              <w:rPr>
-                <w:rFonts w:hint="eastAsia"/>
-              </w:rPr>
-              <w:t>srcFile</w:t>
-            </w:r>
-            <w:r>
-              <w:rPr>
-                <w:rFonts w:hint="eastAsia"/>
-              </w:rPr>
-              <w:t>远程主机源路径</w:t>
-            </w:r>
-          </w:p>
-          <w:p>
-            <w:pPr>
-              <w:ind w:left="34"/>
-            </w:pPr>
-            <w:r>
-              <w:rPr>
-                <w:rFonts w:hint="eastAsia"/>
-              </w:rPr>
-              <w:t xml:space="preserve">- </w:t>
-            </w:r>
-            <w:r>
-              <w:rPr>
-                <w:rFonts w:hint="eastAsia"/>
-              </w:rPr>
-              <w:t>dstFile</w:t>
-            </w:r>
-            <w:r>
-              <w:rPr>
-                <w:rFonts w:hint="eastAsia"/>
-              </w:rPr>
-              <w:t>本地主机目的路径</w:t>
-            </w:r>
-          </w:p>
-          <w:p>
-            <w:pPr>
-              <w:ind w:left="34"/>
-            </w:pPr>
-            <w:r>
-              <w:rPr>
-                <w:rFonts w:hint="eastAsia"/>
-              </w:rPr>
-              <w:t xml:space="preserve">-[isReplace] </w:t>
-            </w:r>
-            <w:r>
-              <w:rPr>
-                <w:rFonts w:hint="eastAsia"/>
-              </w:rPr>
-              <w:t>目的路径已存在时是否替代</w:t>
-            </w:r>
-          </w:p>
-          <w:p>
-            <w:pPr>
-              <w:ind w:left="34"/>
-            </w:pPr>
-            <w:r>
-              <w:rPr>
-                <w:rFonts w:hint="eastAsia"/>
-              </w:rPr>
-              <w:t xml:space="preserve">-[mode] </w:t>
-            </w:r>
-            <w:r>
-              <w:rPr>
-                <w:rFonts w:hint="eastAsia"/>
-              </w:rPr>
-              <w:t>文件权限</w:t>
-            </w:r>
           </w:p>
         </w:tc>
         <w:tc>
@@ -955,13 +793,16 @@
           </w:tcPr>
           <w:p>
             <w:pPr>
-              <w:ind w:leftChars="15" w:left="31"/>
-            </w:pPr>
-            <w:r>
-              <w:rPr>
-                <w:rFonts w:hint="eastAsia"/>
-              </w:rPr>
-              <w:t>无</w:t>
+              <w:ind w:left="0"/>
+            </w:pPr>
+            <w:r>
+              <w:t>N</w:t>
+            </w:r>
+            <w:r>
+              <w:rPr>
+                <w:rFonts w:hint="eastAsia"/>
+              </w:rPr>
+              <w:t>umber</w:t>
             </w:r>
           </w:p>
         </w:tc>
@@ -969,19 +810,553 @@
     </w:tbl>
     <w:p>
       <w:pPr>
-        <w:ind w:leftChars="100" w:left="210"/>
+        <w:rPr>
+          <w:rFonts w:hint="eastAsia"/>
+        </w:rPr>
       </w:pPr>
     </w:p>
     <w:p>
       <w:pPr>
-        <w:ind w:leftChars="100" w:left="210"/>
+        <w:rPr>
+          <w:rFonts w:hint="eastAsia"/>
+        </w:rPr>
       </w:pPr>
     </w:p>
     <w:p>
       <w:pPr>
-        <w:ind w:leftChars="100" w:left="210"/>
-      </w:pPr>
+        <w:rPr>
+          <w:rFonts w:hint="eastAsia"/>
+          <w:b/>
+          <w:sz w:val="28"/>
+          <w:szCs w:val="28"/>
+        </w:rPr>
+      </w:pPr>
+      <w:r>
+        <w:rPr>
+          <w:rFonts w:hint="eastAsia"/>
+          <w:b/>
+          <w:sz w:val="28"/>
+          <w:szCs w:val="28"/>
+        </w:rPr>
+        <w:t>File</w:t>
+      </w:r>
+      <w:r>
+        <w:rPr>
+          <w:rFonts w:hint="eastAsia"/>
+          <w:b/>
+          <w:sz w:val="28"/>
+          <w:szCs w:val="28"/>
+        </w:rPr>
+        <w:t>类新增方法</w:t>
+      </w:r>
     </w:p>
+    <w:tbl>
+      <w:tblPr>
+        <w:tblStyle w:val="TableGrid"/>
+        <w:tblW w:w="8477" w:type="dxa"/>
+        <w:tblInd w:w="420" w:type="dxa"/>
+        <w:tblLayout w:type="fixed"/>
+        <w:tblLook w:val="04A0"/>
+      </w:tblPr>
+      <w:tblGrid>
+        <w:gridCol w:w="3232"/>
+        <w:gridCol w:w="992"/>
+        <w:gridCol w:w="3119"/>
+        <w:gridCol w:w="1134"/>
+      </w:tblGrid>
+      <w:tr>
+        <w:tc>
+          <w:tcPr>
+            <w:tcW w:w="3232" w:type="dxa"/>
+          </w:tcPr>
+          <w:p>
+            <w:pPr>
+              <w:ind w:left="6"/>
+              <w:rPr>
+                <w:b/>
+                <w:color w:val="FF0000"/>
+              </w:rPr>
+            </w:pPr>
+            <w:r>
+              <w:rPr>
+                <w:rFonts w:hint="eastAsia"/>
+                <w:b/>
+                <w:color w:val="FF0000"/>
+              </w:rPr>
+              <w:t>函数名</w:t>
+            </w:r>
+          </w:p>
+        </w:tc>
+        <w:tc>
+          <w:tcPr>
+            <w:tcW w:w="992" w:type="dxa"/>
+          </w:tcPr>
+          <w:p>
+            <w:pPr>
+              <w:ind w:left="0"/>
+              <w:rPr>
+                <w:b/>
+                <w:color w:val="FF0000"/>
+              </w:rPr>
+            </w:pPr>
+            <w:r>
+              <w:rPr>
+                <w:rFonts w:hint="eastAsia"/>
+                <w:b/>
+                <w:color w:val="FF0000"/>
+              </w:rPr>
+              <w:t>描述</w:t>
+            </w:r>
+          </w:p>
+        </w:tc>
+        <w:tc>
+          <w:tcPr>
+            <w:tcW w:w="3119" w:type="dxa"/>
+          </w:tcPr>
+          <w:p>
+            <w:pPr>
+              <w:ind w:left="33"/>
+              <w:rPr>
+                <w:b/>
+                <w:color w:val="FF0000"/>
+              </w:rPr>
+            </w:pPr>
+            <w:r>
+              <w:rPr>
+                <w:rFonts w:hint="eastAsia"/>
+                <w:b/>
+                <w:color w:val="FF0000"/>
+              </w:rPr>
+              <w:t>参数描述</w:t>
+            </w:r>
+          </w:p>
+        </w:tc>
+        <w:tc>
+          <w:tcPr>
+            <w:tcW w:w="1134" w:type="dxa"/>
+          </w:tcPr>
+          <w:p>
+            <w:pPr>
+              <w:ind w:left="34"/>
+              <w:rPr>
+                <w:b/>
+                <w:color w:val="FF0000"/>
+              </w:rPr>
+            </w:pPr>
+            <w:r>
+              <w:rPr>
+                <w:rFonts w:hint="eastAsia"/>
+                <w:b/>
+                <w:color w:val="FF0000"/>
+              </w:rPr>
+              <w:t>返回值</w:t>
+            </w:r>
+          </w:p>
+        </w:tc>
+      </w:tr>
+      <w:tr>
+        <w:tc>
+          <w:tcPr>
+            <w:tcW w:w="3232" w:type="dxa"/>
+          </w:tcPr>
+          <w:p>
+            <w:pPr>
+              <w:ind w:left="6"/>
+            </w:pPr>
+            <w:r>
+              <w:rPr>
+                <w:rFonts w:hint="eastAsia"/>
+              </w:rPr>
+              <w:t>readContent</w:t>
+            </w:r>
+          </w:p>
+        </w:tc>
+        <w:tc>
+          <w:tcPr>
+            <w:tcW w:w="992" w:type="dxa"/>
+          </w:tcPr>
+          <w:p>
+            <w:pPr>
+              <w:ind w:left="34"/>
+            </w:pPr>
+            <w:r>
+              <w:rPr>
+                <w:rFonts w:hint="eastAsia"/>
+              </w:rPr>
+              <w:t>读取文件内容</w:t>
+            </w:r>
+            <w:r>
+              <w:rPr>
+                <w:rFonts w:hint="eastAsia"/>
+              </w:rPr>
+              <w:t>到</w:t>
+            </w:r>
+            <w:r>
+              <w:rPr>
+                <w:rFonts w:hint="eastAsia"/>
+              </w:rPr>
+              <w:lastRenderedPageBreak/>
+              <w:t>FileContent</w:t>
+            </w:r>
+            <w:r>
+              <w:rPr>
+                <w:rFonts w:hint="eastAsia"/>
+              </w:rPr>
+              <w:t>对象中</w:t>
+            </w:r>
+          </w:p>
+        </w:tc>
+        <w:tc>
+          <w:tcPr>
+            <w:tcW w:w="3119" w:type="dxa"/>
+          </w:tcPr>
+          <w:p>
+            <w:pPr>
+              <w:ind w:left="34"/>
+            </w:pPr>
+            <w:r>
+              <w:rPr>
+                <w:rFonts w:hint="eastAsia"/>
+              </w:rPr>
+              <w:lastRenderedPageBreak/>
+              <w:t>[size]</w:t>
+            </w:r>
+            <w:r>
+              <w:rPr>
+                <w:rFonts w:hint="eastAsia"/>
+              </w:rPr>
+              <w:t>：读取内容长度，默认为</w:t>
+            </w:r>
+            <w:r>
+              <w:rPr>
+                <w:rFonts w:hint="eastAsia"/>
+              </w:rPr>
+              <w:t>1024</w:t>
+            </w:r>
+          </w:p>
+        </w:tc>
+        <w:tc>
+          <w:tcPr>
+            <w:tcW w:w="1134" w:type="dxa"/>
+          </w:tcPr>
+          <w:p>
+            <w:pPr>
+              <w:ind w:left="0"/>
+            </w:pPr>
+            <w:r>
+              <w:rPr>
+                <w:rFonts w:hint="eastAsia"/>
+              </w:rPr>
+              <w:t>FileContent</w:t>
+            </w:r>
+          </w:p>
+        </w:tc>
+      </w:tr>
+      <w:tr>
+        <w:tc>
+          <w:tcPr>
+            <w:tcW w:w="3232" w:type="dxa"/>
+          </w:tcPr>
+          <w:p>
+            <w:pPr>
+              <w:ind w:left="6"/>
+            </w:pPr>
+            <w:r>
+              <w:rPr>
+                <w:rFonts w:hint="eastAsia"/>
+              </w:rPr>
+              <w:lastRenderedPageBreak/>
+              <w:t>writeContent</w:t>
+            </w:r>
+          </w:p>
+        </w:tc>
+        <w:tc>
+          <w:tcPr>
+            <w:tcW w:w="992" w:type="dxa"/>
+          </w:tcPr>
+          <w:p>
+            <w:pPr>
+              <w:ind w:left="34"/>
+            </w:pPr>
+            <w:r>
+              <w:rPr>
+                <w:rFonts w:hint="eastAsia"/>
+              </w:rPr>
+              <w:t>将</w:t>
+            </w:r>
+            <w:r>
+              <w:rPr>
+                <w:rFonts w:hint="eastAsia"/>
+              </w:rPr>
+              <w:t>FileContent</w:t>
+            </w:r>
+            <w:r>
+              <w:rPr>
+                <w:rFonts w:hint="eastAsia"/>
+              </w:rPr>
+              <w:t>的内容写到文件中</w:t>
+            </w:r>
+          </w:p>
+        </w:tc>
+        <w:tc>
+          <w:tcPr>
+            <w:tcW w:w="3119" w:type="dxa"/>
+          </w:tcPr>
+          <w:p>
+            <w:pPr>
+              <w:ind w:left="34"/>
+            </w:pPr>
+            <w:r>
+              <w:rPr>
+                <w:rFonts w:hint="eastAsia"/>
+              </w:rPr>
+              <w:t>FileContent</w:t>
+            </w:r>
+            <w:r>
+              <w:rPr>
+                <w:rFonts w:hint="eastAsia"/>
+              </w:rPr>
+              <w:t>：写入的</w:t>
+            </w:r>
+            <w:r>
+              <w:rPr>
+                <w:rFonts w:hint="eastAsia"/>
+              </w:rPr>
+              <w:t>FileContent</w:t>
+            </w:r>
+            <w:r>
+              <w:rPr>
+                <w:rFonts w:hint="eastAsia"/>
+              </w:rPr>
+              <w:t>对象</w:t>
+            </w:r>
+          </w:p>
+        </w:tc>
+        <w:tc>
+          <w:tcPr>
+            <w:tcW w:w="1134" w:type="dxa"/>
+          </w:tcPr>
+          <w:p>
+            <w:pPr>
+              <w:ind w:left="0"/>
+            </w:pPr>
+            <w:r>
+              <w:rPr>
+                <w:rFonts w:hint="eastAsia"/>
+              </w:rPr>
+              <w:t>无</w:t>
+            </w:r>
+          </w:p>
+        </w:tc>
+      </w:tr>
+      <w:tr>
+        <w:tc>
+          <w:tcPr>
+            <w:tcW w:w="3232" w:type="dxa"/>
+          </w:tcPr>
+          <w:p>
+            <w:pPr>
+              <w:ind w:left="6"/>
+            </w:pPr>
+            <w:r>
+              <w:rPr>
+                <w:rFonts w:hint="eastAsia"/>
+              </w:rPr>
+              <w:t>File.scp( srcFile, dstFile, [isReplace], [mode] )</w:t>
+            </w:r>
+          </w:p>
+        </w:tc>
+        <w:tc>
+          <w:tcPr>
+            <w:tcW w:w="992" w:type="dxa"/>
+          </w:tcPr>
+          <w:p>
+            <w:pPr>
+              <w:ind w:left="34"/>
+            </w:pPr>
+            <w:r>
+              <w:rPr>
+                <w:rFonts w:hint="eastAsia"/>
+              </w:rPr>
+              <w:t>从源文件路径拷贝文件到目的文件路径</w:t>
+            </w:r>
+          </w:p>
+        </w:tc>
+        <w:tc>
+          <w:tcPr>
+            <w:tcW w:w="3119" w:type="dxa"/>
+          </w:tcPr>
+          <w:p>
+            <w:pPr>
+              <w:ind w:left="34"/>
+            </w:pPr>
+            <w:r>
+              <w:rPr>
+                <w:rFonts w:hint="eastAsia"/>
+              </w:rPr>
+              <w:t>- srcFile</w:t>
+            </w:r>
+            <w:r>
+              <w:rPr>
+                <w:rFonts w:hint="eastAsia"/>
+              </w:rPr>
+              <w:t>文件源路径</w:t>
+            </w:r>
+          </w:p>
+          <w:p>
+            <w:pPr>
+              <w:ind w:left="34"/>
+            </w:pPr>
+            <w:r>
+              <w:rPr>
+                <w:rFonts w:hint="eastAsia"/>
+              </w:rPr>
+              <w:t>- dstFile</w:t>
+            </w:r>
+            <w:r>
+              <w:rPr>
+                <w:rFonts w:hint="eastAsia"/>
+              </w:rPr>
+              <w:t>目的文件路径</w:t>
+            </w:r>
+          </w:p>
+          <w:p>
+            <w:pPr>
+              <w:ind w:left="34"/>
+            </w:pPr>
+            <w:r>
+              <w:rPr>
+                <w:rFonts w:hint="eastAsia"/>
+              </w:rPr>
+              <w:t xml:space="preserve">-[isReplace] </w:t>
+            </w:r>
+            <w:r>
+              <w:rPr>
+                <w:rFonts w:hint="eastAsia"/>
+              </w:rPr>
+              <w:t>目的路径已存在时是否替代</w:t>
+            </w:r>
+          </w:p>
+          <w:p>
+            <w:pPr>
+              <w:ind w:left="34"/>
+            </w:pPr>
+            <w:r>
+              <w:rPr>
+                <w:rFonts w:hint="eastAsia"/>
+              </w:rPr>
+              <w:t xml:space="preserve">-[mode] </w:t>
+            </w:r>
+            <w:r>
+              <w:rPr>
+                <w:rFonts w:hint="eastAsia"/>
+              </w:rPr>
+              <w:t>文件权限</w:t>
+            </w:r>
+          </w:p>
+        </w:tc>
+        <w:tc>
+          <w:tcPr>
+            <w:tcW w:w="1134" w:type="dxa"/>
+          </w:tcPr>
+          <w:p>
+            <w:pPr>
+              <w:ind w:left="0"/>
+            </w:pPr>
+            <w:r>
+              <w:rPr>
+                <w:rFonts w:hint="eastAsia"/>
+              </w:rPr>
+              <w:t>无</w:t>
+            </w:r>
+          </w:p>
+        </w:tc>
+      </w:tr>
+      <w:tr>
+        <w:tc>
+          <w:tcPr>
+            <w:tcW w:w="3232" w:type="dxa"/>
+          </w:tcPr>
+          <w:p>
+            <w:pPr>
+              <w:ind w:left="6"/>
+              <w:rPr>
+                <w:rFonts w:hint="eastAsia"/>
+              </w:rPr>
+            </w:pPr>
+            <w:r>
+              <w:rPr>
+                <w:rFonts w:hint="eastAsia"/>
+              </w:rPr>
+              <w:t>_getPermission( pathname )</w:t>
+            </w:r>
+          </w:p>
+        </w:tc>
+        <w:tc>
+          <w:tcPr>
+            <w:tcW w:w="992" w:type="dxa"/>
+          </w:tcPr>
+          <w:p>
+            <w:pPr>
+              <w:ind w:left="34"/>
+              <w:rPr>
+                <w:rFonts w:hint="eastAsia"/>
+              </w:rPr>
+            </w:pPr>
+            <w:r>
+              <w:rPr>
+                <w:rFonts w:hint="eastAsia"/>
+              </w:rPr>
+              <w:t>获取路径权限</w:t>
+            </w:r>
+          </w:p>
+        </w:tc>
+        <w:tc>
+          <w:tcPr>
+            <w:tcW w:w="3119" w:type="dxa"/>
+          </w:tcPr>
+          <w:p>
+            <w:pPr>
+              <w:ind w:left="34"/>
+              <w:rPr>
+                <w:rFonts w:hint="eastAsia"/>
+              </w:rPr>
+            </w:pPr>
+            <w:r>
+              <w:rPr>
+                <w:rFonts w:hint="eastAsia"/>
+              </w:rPr>
+              <w:t>-pathname:</w:t>
+            </w:r>
+            <w:r>
+              <w:rPr>
+                <w:rFonts w:hint="eastAsia"/>
+              </w:rPr>
+              <w:t>路径名</w:t>
+            </w:r>
+          </w:p>
+        </w:tc>
+        <w:tc>
+          <w:tcPr>
+            <w:tcW w:w="1134" w:type="dxa"/>
+          </w:tcPr>
+          <w:p>
+            <w:pPr>
+              <w:ind w:left="0"/>
+              <w:rPr>
+                <w:rFonts w:hint="eastAsia"/>
+              </w:rPr>
+            </w:pPr>
+            <w:r>
+              <w:rPr>
+                <w:rFonts w:hint="eastAsia"/>
+              </w:rPr>
+              <w:t>number</w:t>
+            </w:r>
+          </w:p>
+        </w:tc>
+      </w:tr>
+    </w:tbl>
     <w:p>
       <w:pPr>
         <w:ind w:leftChars="100" w:left="210"/>
@@ -1025,6 +1400,12 @@
         <w:rPr>
           <w:rFonts w:hint="eastAsia"/>
         </w:rPr>
+        <w:t>利用现有</w:t>
+      </w:r>
+      <w:r>
+        <w:rPr>
+          <w:rFonts w:hint="eastAsia"/>
+        </w:rPr>
         <w:t>服务端</w:t>
       </w:r>
       <w:r>
@@ -1113,35 +1494,47 @@
       </w:r>
     </w:p>
     <w:p>
-      <w:pPr>
-        <w:pStyle w:val="Heading2"/>
-      </w:pPr>
-      <w:r>
-        <w:rPr>
-          <w:rFonts w:hint="eastAsia"/>
-        </w:rPr>
-        <w:t xml:space="preserve">Story </w:t>
-      </w:r>
-      <w:r>
-        <w:rPr>
-          <w:rFonts w:hint="eastAsia"/>
-        </w:rPr>
-        <w:t>简单设计</w:t>
+      <w:r>
+        <w:rPr>
+          <w:rFonts w:hint="eastAsia"/>
+        </w:rPr>
+        <w:t>另外需要添加获取文件权限的功能。</w:t>
       </w:r>
     </w:p>
     <w:p>
       <w:pPr>
-        <w:pStyle w:val="Heading3"/>
-      </w:pPr>
-      <w:r>
-        <w:rPr>
-          <w:rFonts w:hint="eastAsia"/>
-        </w:rPr>
-        <w:t>相关模块架构图</w:t>
+        <w:pStyle w:val="Heading2"/>
+      </w:pPr>
+      <w:r>
+        <w:rPr>
+          <w:rFonts w:hint="eastAsia"/>
+        </w:rPr>
+        <w:lastRenderedPageBreak/>
+        <w:t xml:space="preserve">Story </w:t>
+      </w:r>
+      <w:r>
+        <w:rPr>
+          <w:rFonts w:hint="eastAsia"/>
+        </w:rPr>
+        <w:t>简单设计</w:t>
       </w:r>
     </w:p>
     <w:p>
-      <w:r>
+      <w:pPr>
+        <w:pStyle w:val="Heading3"/>
+      </w:pPr>
+      <w:r>
+        <w:rPr>
+          <w:rFonts w:hint="eastAsia"/>
+        </w:rPr>
+        <w:t>相关模块架构图</w:t>
+      </w:r>
+    </w:p>
+    <w:p>
+      <w:r>
+        <w:rPr>
+          <w:noProof/>
+        </w:rPr>
         <w:drawing>
           <wp:inline distT="0" distB="0" distL="0" distR="0">
             <wp:extent cx="5274310" cy="5246816"/>
@@ -1197,13 +1590,13 @@
         <w:rPr>
           <w:rFonts w:hint="eastAsia"/>
         </w:rPr>
-        <w:lastRenderedPageBreak/>
         <w:t>主要操作流程</w:t>
       </w:r>
     </w:p>
+    <w:p/>
     <w:p>
       <w:r>
-        <w:object w:dxaOrig="8404" w:dyaOrig="12308">
+        <w:object w:dxaOrig="8403" w:dyaOrig="12307">
           <v:shapetype id="_x0000_t75" coordsize="21600,21600" o:spt="75" o:preferrelative="t" path="m@4@5l@4@11@9@11@9@5xe" filled="f" stroked="f">
             <v:stroke joinstyle="miter"/>
             <v:formulas>
@@ -1226,7 +1619,7 @@
           <v:shape id="_x0000_i1025" type="#_x0000_t75" style="width:370.9pt;height:542.5pt" o:ole="">
             <v:imagedata r:id="rId9" o:title=""/>
           </v:shape>
-          <o:OLEObject Type="Embed" ProgID="Visio.Drawing.11" ShapeID="_x0000_i1025" DrawAspect="Content" ObjectID="_1550044416" r:id="rId10"/>
+          <o:OLEObject Type="Embed" ProgID="Visio.Drawing.11" ShapeID="_x0000_i1025" DrawAspect="Content" ObjectID="_1552117638" r:id="rId10"/>
         </w:object>
       </w:r>
     </w:p>
@@ -1234,18 +1627,12 @@
       <w:pPr>
         <w:pStyle w:val="ListParagraph"/>
         <w:ind w:left="777" w:firstLineChars="0" w:firstLine="0"/>
-        <w:rPr>
-          <w:rFonts w:hint="eastAsia"/>
-        </w:rPr>
       </w:pPr>
     </w:p>
     <w:p>
       <w:pPr>
         <w:pStyle w:val="ListParagraph"/>
         <w:ind w:left="777" w:firstLineChars="0" w:firstLine="0"/>
-        <w:rPr>
-          <w:rFonts w:hint="eastAsia"/>
-        </w:rPr>
       </w:pPr>
     </w:p>
     <w:p>
@@ -1256,13 +1643,120 @@
     </w:p>
     <w:p>
       <w:pPr>
+        <w:pStyle w:val="ListParagraph"/>
+        <w:ind w:left="777" w:firstLineChars="0" w:firstLine="0"/>
+      </w:pPr>
+    </w:p>
+    <w:p>
+      <w:pPr>
+        <w:pStyle w:val="ListParagraph"/>
+        <w:ind w:left="777" w:firstLineChars="0" w:firstLine="0"/>
+      </w:pPr>
+    </w:p>
+    <w:p>
+      <w:pPr>
+        <w:pStyle w:val="ListParagraph"/>
+        <w:ind w:left="777" w:firstLineChars="0" w:firstLine="0"/>
+        <w:rPr>
+          <w:rFonts w:hint="eastAsia"/>
+        </w:rPr>
+      </w:pPr>
+    </w:p>
+    <w:p>
+      <w:pPr>
+        <w:pStyle w:val="ListParagraph"/>
+        <w:ind w:left="777" w:firstLineChars="0" w:firstLine="0"/>
+        <w:rPr>
+          <w:rFonts w:hint="eastAsia"/>
+        </w:rPr>
+      </w:pPr>
+    </w:p>
+    <w:p>
+      <w:pPr>
+        <w:pStyle w:val="ListParagraph"/>
+        <w:ind w:left="777" w:firstLineChars="0" w:firstLine="0"/>
+        <w:rPr>
+          <w:rFonts w:hint="eastAsia"/>
+        </w:rPr>
+      </w:pPr>
+    </w:p>
+    <w:p>
+      <w:pPr>
+        <w:pStyle w:val="ListParagraph"/>
+        <w:ind w:left="777" w:firstLineChars="0" w:firstLine="0"/>
+      </w:pPr>
+    </w:p>
+    <w:p>
+      <w:pPr>
+        <w:pStyle w:val="ListParagraph"/>
+        <w:numPr>
+          <w:ilvl w:val="0"/>
+          <w:numId w:val="19"/>
+        </w:numPr>
+        <w:ind w:firstLineChars="0"/>
+        <w:rPr>
+          <w:b/>
+          <w:sz w:val="30"/>
+          <w:szCs w:val="30"/>
+        </w:rPr>
+      </w:pPr>
+      <w:r>
+        <w:rPr>
+          <w:rFonts w:hint="eastAsia"/>
+          <w:b/>
+          <w:sz w:val="30"/>
+          <w:szCs w:val="30"/>
+        </w:rPr>
+        <w:lastRenderedPageBreak/>
+        <w:t>传输细节</w:t>
+      </w:r>
+    </w:p>
+    <w:p>
+      <w:pPr>
+        <w:pStyle w:val="ListParagraph"/>
+        <w:numPr>
+          <w:ilvl w:val="0"/>
+          <w:numId w:val="20"/>
+        </w:numPr>
+        <w:ind w:firstLineChars="0"/>
+        <w:rPr>
+          <w:sz w:val="28"/>
+          <w:szCs w:val="28"/>
+        </w:rPr>
+      </w:pPr>
+      <w:r>
+        <w:rPr>
+          <w:rFonts w:hint="eastAsia"/>
+          <w:sz w:val="28"/>
+          <w:szCs w:val="28"/>
+        </w:rPr>
+        <w:t>每次传输</w:t>
+      </w:r>
+      <w:r>
+        <w:rPr>
+          <w:rFonts w:hint="eastAsia"/>
+          <w:sz w:val="28"/>
+          <w:szCs w:val="28"/>
+        </w:rPr>
+        <w:t>4M</w:t>
+      </w:r>
+      <w:r>
+        <w:rPr>
+          <w:rFonts w:hint="eastAsia"/>
+          <w:sz w:val="28"/>
+          <w:szCs w:val="28"/>
+        </w:rPr>
+        <w:t>大小数据。</w:t>
+      </w:r>
+    </w:p>
+    <w:p>
+      <w:pPr>
         <w:pStyle w:val="Heading2"/>
       </w:pPr>
       <w:r>
         <w:rPr>
           <w:rFonts w:hint="eastAsia"/>
         </w:rPr>
-        <w:lastRenderedPageBreak/>
         <w:t>遗留问题</w:t>
       </w:r>
     </w:p>
@@ -1274,8 +1768,8 @@
         <w:tblLook w:val="04A0"/>
       </w:tblPr>
       <w:tblGrid>
-        <w:gridCol w:w="4092"/>
-        <w:gridCol w:w="4073"/>
+        <w:gridCol w:w="4083"/>
+        <w:gridCol w:w="4082"/>
       </w:tblGrid>
       <w:tr>
         <w:tc>
@@ -1286,38 +1780,9 @@
             <w:pPr>
               <w:ind w:left="0"/>
               <w:rPr>
-                <w:rFonts w:hint="eastAsia"/>
                 <w:color w:val="000000" w:themeColor="text1"/>
               </w:rPr>
             </w:pPr>
-            <w:r>
-              <w:rPr>
-                <w:rFonts w:hint="eastAsia"/>
-                <w:color w:val="000000" w:themeColor="text1"/>
-              </w:rPr>
-              <w:t>由于远端文件每次读写都要有打开，读写</w:t>
-            </w:r>
-            <w:r>
-              <w:rPr>
-                <w:rFonts w:hint="eastAsia"/>
-                <w:color w:val="000000" w:themeColor="text1"/>
-              </w:rPr>
-              <w:t>、</w:t>
-            </w:r>
-            <w:r>
-              <w:rPr>
-                <w:rFonts w:hint="eastAsia"/>
-                <w:color w:val="000000" w:themeColor="text1"/>
-              </w:rPr>
-              <w:t>关闭的过程，效率比较低</w:t>
-            </w:r>
-            <w:r>
-              <w:rPr>
-                <w:rFonts w:hint="eastAsia"/>
-                <w:color w:val="000000" w:themeColor="text1"/>
-              </w:rPr>
-              <w:t>。</w:t>
-            </w:r>
           </w:p>
         </w:tc>
         <w:tc>
@@ -1328,7 +1793,6 @@
             <w:pPr>
               <w:ind w:left="0"/>
               <w:rPr>
-                <w:rFonts w:hint="eastAsia"/>
                 <w:color w:val="00B0F0"/>
               </w:rPr>
             </w:pPr>
@@ -1336,6 +1800,9 @@
         </w:tc>
       </w:tr>
       <w:tr>
+        <w:trPr>
+          <w:trHeight w:val="77"/>
+        </w:trPr>
         <w:tc>
           <w:tcPr>
             <w:tcW w:w="4261" w:type="dxa"/>
@@ -1344,17 +1811,9 @@
             <w:pPr>
               <w:ind w:left="0"/>
               <w:rPr>
-                <w:rFonts w:hint="eastAsia"/>
                 <w:color w:val="000000" w:themeColor="text1"/>
               </w:rPr>
             </w:pPr>
-            <w:r>
-              <w:rPr>
-                <w:rFonts w:hint="eastAsia"/>
-                <w:color w:val="000000" w:themeColor="text1"/>
-              </w:rPr>
-              <w:t>互斥性问题，多个主机同时往一台主机拷贝文件内容会混杂。</w:t>
-            </w:r>
           </w:p>
         </w:tc>
         <w:tc>
@@ -1365,7 +1824,6 @@
             <w:pPr>
               <w:ind w:left="0"/>
               <w:rPr>
-                <w:rFonts w:hint="eastAsia"/>
                 <w:color w:val="00B0F0"/>
               </w:rPr>
             </w:pPr>
@@ -1376,7 +1834,6 @@
     <w:p>
       <w:pPr>
         <w:rPr>
-          <w:rFonts w:hint="eastAsia"/>
           <w:color w:val="00B0F0"/>
         </w:rPr>
       </w:pPr>
@@ -1384,7 +1841,6 @@
     <w:p>
       <w:pPr>
         <w:rPr>
-          <w:rFonts w:hint="eastAsia"/>
           <w:color w:val="00B0F0"/>
         </w:rPr>
       </w:pPr>
@@ -1392,7 +1848,6 @@
     <w:p>
       <w:pPr>
         <w:rPr>
-          <w:rFonts w:hint="eastAsia"/>
           <w:color w:val="00B0F0"/>
         </w:rPr>
       </w:pPr>
@@ -1634,18 +2089,15 @@
           <w:p>
             <w:pPr>
               <w:ind w:left="0"/>
-            </w:pPr>
-            <w:r>
-              <w:rPr>
-                <w:rFonts w:hint="eastAsia"/>
-              </w:rPr>
-              <w:t>Story.sdb.jsObject 003.</w:t>
-            </w:r>
-            <w:r>
-              <w:rPr>
-                <w:rFonts w:hint="eastAsia"/>
-              </w:rPr>
-              <w:t>001</w:t>
+              <w:rPr>
+                <w:rFonts w:hint="eastAsia"/>
+              </w:rPr>
+            </w:pPr>
+            <w:r>
+              <w:rPr>
+                <w:rFonts w:hint="eastAsia"/>
+              </w:rPr>
+              <w:t>Story.sdb.jsObject 003.001</w:t>
             </w:r>
           </w:p>
         </w:tc>
@@ -1656,12 +2108,15 @@
           <w:p>
             <w:pPr>
               <w:ind w:left="0"/>
-            </w:pPr>
-            <w:r>
-              <w:rPr>
-                <w:rFonts w:hint="eastAsia"/>
-              </w:rPr>
-              <w:t>push</w:t>
+              <w:rPr>
+                <w:rFonts w:hint="eastAsia"/>
+              </w:rPr>
+            </w:pPr>
+            <w:r>
+              <w:rPr>
+                <w:rFonts w:hint="eastAsia"/>
+              </w:rPr>
+              <w:t>readContent</w:t>
             </w:r>
             <w:r>
               <w:rPr>
@@ -1683,12 +2138,15 @@
                 <w:numId w:val="3"/>
               </w:numPr>
               <w:ind w:firstLineChars="0"/>
-            </w:pPr>
-            <w:r>
-              <w:rPr>
-                <w:rFonts w:hint="eastAsia"/>
-              </w:rPr>
-              <w:t>创建远程</w:t>
+              <w:rPr>
+                <w:rFonts w:hint="eastAsia"/>
+              </w:rPr>
+            </w:pPr>
+            <w:r>
+              <w:rPr>
+                <w:rFonts w:hint="eastAsia"/>
+              </w:rPr>
+              <w:t>创建</w:t>
             </w:r>
             <w:r>
               <w:rPr>
@@ -1700,7 +2158,7 @@
               <w:rPr>
                 <w:rFonts w:hint="eastAsia"/>
               </w:rPr>
-              <w:t>对象</w:t>
+              <w:t>对象。</w:t>
             </w:r>
           </w:p>
           <w:p>
@@ -1711,6 +2169,9 @@
                 <w:numId w:val="3"/>
               </w:numPr>
               <w:ind w:firstLineChars="0"/>
+              <w:rPr>
+                <w:rFonts w:hint="eastAsia"/>
+              </w:rPr>
             </w:pPr>
             <w:r>
               <w:rPr>
@@ -1722,13 +2183,7 @@
               <w:rPr>
                 <w:rFonts w:hint="eastAsia"/>
               </w:rPr>
-              <w:t>push</w:t>
-            </w:r>
-            <w:r>
-              <w:rPr>
-                <w:rFonts w:hint="eastAsia"/>
-              </w:rPr>
-              <w:t>方法</w:t>
+              <w:t>readContent()</w:t>
             </w:r>
           </w:p>
         </w:tc>
@@ -1751,67 +2206,53 @@
               <w:rPr>
                 <w:rFonts w:hint="eastAsia"/>
               </w:rPr>
+              <w:t>：文件中的内容被读取到</w:t>
+            </w:r>
+            <w:r>
+              <w:rPr>
+                <w:rFonts w:hint="eastAsia"/>
+              </w:rPr>
+              <w:t>FileContent</w:t>
+            </w:r>
+            <w:r>
+              <w:rPr>
+                <w:rFonts w:hint="eastAsia"/>
+              </w:rPr>
+              <w:t>对象中。</w:t>
+            </w:r>
+          </w:p>
+          <w:p>
+            <w:pPr>
+              <w:ind w:left="0"/>
+              <w:rPr>
+                <w:rFonts w:hint="eastAsia"/>
+                <w:b/>
+              </w:rPr>
+            </w:pPr>
+            <w:r>
+              <w:rPr>
+                <w:rFonts w:hint="eastAsia"/>
+                <w:b/>
+              </w:rPr>
+              <w:t>失败</w:t>
+            </w:r>
+            <w:r>
+              <w:rPr>
+                <w:rFonts w:hint="eastAsia"/>
+              </w:rPr>
               <w:t>：</w:t>
             </w:r>
             <w:r>
               <w:rPr>
                 <w:rFonts w:hint="eastAsia"/>
               </w:rPr>
-              <w:t>文件成功从本地主机拷贝到远程主机</w:t>
-            </w:r>
-          </w:p>
-          <w:p>
-            <w:pPr>
-              <w:ind w:left="0"/>
-            </w:pPr>
-            <w:r>
-              <w:rPr>
-                <w:rFonts w:hint="eastAsia"/>
-                <w:b/>
-              </w:rPr>
-              <w:t>失败</w:t>
-            </w:r>
-            <w:r>
-              <w:rPr>
-                <w:rFonts w:hint="eastAsia"/>
-              </w:rPr>
-              <w:t>：</w:t>
-            </w:r>
-            <w:r>
-              <w:rPr>
-                <w:rFonts w:hint="eastAsia"/>
-              </w:rPr>
               <w:t xml:space="preserve"> </w:t>
             </w:r>
             <w:r>
               <w:rPr>
                 <w:rFonts w:hint="eastAsia"/>
               </w:rPr>
-              <w:t>抛</w:t>
-            </w:r>
-            <w:r>
-              <w:rPr>
-                <w:rFonts w:hint="eastAsia"/>
-              </w:rPr>
-              <w:t>异常</w:t>
-            </w:r>
-            <w:r>
-              <w:rPr>
-                <w:rFonts w:hint="eastAsia"/>
-              </w:rPr>
-              <w:t>和</w:t>
-            </w:r>
-            <w:r>
-              <w:rPr>
-                <w:rFonts w:hint="eastAsia"/>
-              </w:rPr>
-              <w:t>具体</w:t>
-            </w:r>
-            <w:r>
-              <w:rPr>
-                <w:rFonts w:hint="eastAsia"/>
-              </w:rPr>
-              <w:t>错误细节</w:t>
+              <w:t>抛异常和具体错误细节</w:t>
             </w:r>
           </w:p>
         </w:tc>
@@ -1824,18 +2265,15 @@
           <w:p>
             <w:pPr>
               <w:ind w:left="0"/>
-            </w:pPr>
-            <w:r>
-              <w:rPr>
-                <w:rFonts w:hint="eastAsia"/>
-              </w:rPr>
-              <w:t>Story.sdb.jsObject 003</w:t>
-            </w:r>
-            <w:r>
-              <w:rPr>
-                <w:rFonts w:hint="eastAsia"/>
-              </w:rPr>
-              <w:t>.002</w:t>
+              <w:rPr>
+                <w:rFonts w:hint="eastAsia"/>
+              </w:rPr>
+            </w:pPr>
+            <w:r>
+              <w:rPr>
+                <w:rFonts w:hint="eastAsia"/>
+              </w:rPr>
+              <w:t>Story.sdb.jsObject 003.002</w:t>
             </w:r>
           </w:p>
         </w:tc>
@@ -1846,9 +2284,15 @@
           <w:p>
             <w:pPr>
               <w:ind w:left="0"/>
-            </w:pPr>
-            <w:r>
-              <w:t>pull</w:t>
+              <w:rPr>
+                <w:rFonts w:hint="eastAsia"/>
+              </w:rPr>
+            </w:pPr>
+            <w:r>
+              <w:rPr>
+                <w:rFonts w:hint="eastAsia"/>
+              </w:rPr>
+              <w:t>writeContent</w:t>
             </w:r>
             <w:r>
               <w:rPr>
@@ -1867,15 +2311,18 @@
               <w:pStyle w:val="ListParagraph"/>
               <w:numPr>
                 <w:ilvl w:val="0"/>
-                <w:numId w:val="11"/>
+                <w:numId w:val="25"/>
               </w:numPr>
               <w:ind w:firstLineChars="0"/>
-            </w:pPr>
-            <w:r>
-              <w:rPr>
-                <w:rFonts w:hint="eastAsia"/>
-              </w:rPr>
-              <w:t>创建远程</w:t>
+              <w:rPr>
+                <w:rFonts w:hint="eastAsia"/>
+              </w:rPr>
+            </w:pPr>
+            <w:r>
+              <w:rPr>
+                <w:rFonts w:hint="eastAsia"/>
+              </w:rPr>
+              <w:t>创建</w:t>
             </w:r>
             <w:r>
               <w:rPr>
@@ -1887,7 +2334,7 @@
               <w:rPr>
                 <w:rFonts w:hint="eastAsia"/>
               </w:rPr>
-              <w:t>对象</w:t>
+              <w:t>对象。</w:t>
             </w:r>
           </w:p>
           <w:p>
@@ -1895,9 +2342,12 @@
               <w:pStyle w:val="ListParagraph"/>
               <w:numPr>
                 <w:ilvl w:val="0"/>
-                <w:numId w:val="11"/>
+                <w:numId w:val="25"/>
               </w:numPr>
               <w:ind w:firstLineChars="0"/>
+              <w:rPr>
+                <w:rFonts w:hint="eastAsia"/>
+              </w:rPr>
             </w:pPr>
             <w:r>
               <w:rPr>
@@ -1909,7 +2359,226 @@
               <w:rPr>
                 <w:rFonts w:hint="eastAsia"/>
               </w:rPr>
-              <w:t>pull</w:t>
+              <w:t>readContent()</w:t>
+            </w:r>
+          </w:p>
+        </w:tc>
+        <w:tc>
+          <w:tcPr>
+            <w:tcW w:w="1690" w:type="dxa"/>
+          </w:tcPr>
+          <w:p>
+            <w:pPr>
+              <w:ind w:left="0"/>
+            </w:pPr>
+            <w:r>
+              <w:rPr>
+                <w:rFonts w:hint="eastAsia"/>
+                <w:b/>
+              </w:rPr>
+              <w:t>成功</w:t>
+            </w:r>
+            <w:r>
+              <w:rPr>
+                <w:rFonts w:hint="eastAsia"/>
+              </w:rPr>
+              <w:t>：</w:t>
+            </w:r>
+            <w:r>
+              <w:rPr>
+                <w:rFonts w:hint="eastAsia"/>
+              </w:rPr>
+              <w:t>FileContent</w:t>
+            </w:r>
+            <w:r>
+              <w:rPr>
+                <w:rFonts w:hint="eastAsia"/>
+              </w:rPr>
+              <w:t>中的内容成功写到文件中。</w:t>
+            </w:r>
+          </w:p>
+          <w:p>
+            <w:pPr>
+              <w:ind w:left="0"/>
+              <w:rPr>
+                <w:rFonts w:hint="eastAsia"/>
+                <w:b/>
+              </w:rPr>
+            </w:pPr>
+            <w:r>
+              <w:rPr>
+                <w:rFonts w:hint="eastAsia"/>
+                <w:b/>
+              </w:rPr>
+              <w:t>失败</w:t>
+            </w:r>
+            <w:r>
+              <w:rPr>
+                <w:rFonts w:hint="eastAsia"/>
+              </w:rPr>
+              <w:t>：</w:t>
+            </w:r>
+            <w:r>
+              <w:rPr>
+                <w:rFonts w:hint="eastAsia"/>
+              </w:rPr>
+              <w:t xml:space="preserve"> </w:t>
+            </w:r>
+            <w:r>
+              <w:rPr>
+                <w:rFonts w:hint="eastAsia"/>
+              </w:rPr>
+              <w:t>抛异常和具体错误细节</w:t>
+            </w:r>
+          </w:p>
+        </w:tc>
+      </w:tr>
+      <w:tr>
+        <w:tc>
+          <w:tcPr>
+            <w:tcW w:w="2492" w:type="dxa"/>
+          </w:tcPr>
+          <w:p>
+            <w:pPr>
+              <w:ind w:left="0"/>
+              <w:rPr>
+                <w:rFonts w:hint="eastAsia"/>
+              </w:rPr>
+            </w:pPr>
+            <w:r>
+              <w:rPr>
+                <w:rFonts w:hint="eastAsia"/>
+              </w:rPr>
+              <w:t>Story.sdb.jsObject 003.003</w:t>
+            </w:r>
+          </w:p>
+        </w:tc>
+        <w:tc>
+          <w:tcPr>
+            <w:tcW w:w="1647" w:type="dxa"/>
+          </w:tcPr>
+          <w:p>
+            <w:pPr>
+              <w:ind w:left="0"/>
+              <w:rPr>
+                <w:rFonts w:hint="eastAsia"/>
+              </w:rPr>
+            </w:pPr>
+            <w:r>
+              <w:rPr>
+                <w:rFonts w:hint="eastAsia"/>
+              </w:rPr>
+              <w:t>getLength</w:t>
+            </w:r>
+            <w:r>
+              <w:rPr>
+                <w:rFonts w:hint="eastAsia"/>
+              </w:rPr>
+              <w:t>功能测试</w:t>
+            </w:r>
+          </w:p>
+        </w:tc>
+        <w:tc>
+          <w:tcPr>
+            <w:tcW w:w="2336" w:type="dxa"/>
+          </w:tcPr>
+          <w:p>
+            <w:pPr>
+              <w:pStyle w:val="ListParagraph"/>
+              <w:numPr>
+                <w:ilvl w:val="0"/>
+                <w:numId w:val="26"/>
+              </w:numPr>
+              <w:ind w:firstLineChars="0"/>
+              <w:rPr>
+                <w:rFonts w:hint="eastAsia"/>
+              </w:rPr>
+            </w:pPr>
+            <w:r>
+              <w:rPr>
+                <w:rFonts w:hint="eastAsia"/>
+              </w:rPr>
+              <w:t>创建</w:t>
+            </w:r>
+            <w:r>
+              <w:rPr>
+                <w:rFonts w:hint="eastAsia"/>
+              </w:rPr>
+              <w:t>File</w:t>
+            </w:r>
+            <w:r>
+              <w:rPr>
+                <w:rFonts w:hint="eastAsia"/>
+              </w:rPr>
+              <w:t>对象。</w:t>
+            </w:r>
+          </w:p>
+          <w:p>
+            <w:pPr>
+              <w:pStyle w:val="ListParagraph"/>
+              <w:numPr>
+                <w:ilvl w:val="0"/>
+                <w:numId w:val="26"/>
+              </w:numPr>
+              <w:ind w:firstLineChars="0"/>
+              <w:rPr>
+                <w:rFonts w:hint="eastAsia"/>
+              </w:rPr>
+            </w:pPr>
+            <w:r>
+              <w:rPr>
+                <w:rFonts w:hint="eastAsia"/>
+              </w:rPr>
+              <w:t>调用</w:t>
+            </w:r>
+            <w:r>
+              <w:rPr>
+                <w:rFonts w:hint="eastAsia"/>
+              </w:rPr>
+              <w:t>readContent()</w:t>
+            </w:r>
+            <w:r>
+              <w:rPr>
+                <w:rFonts w:hint="eastAsia"/>
+              </w:rPr>
+              <w:t>获得</w:t>
+            </w:r>
+            <w:r>
+              <w:rPr>
+                <w:rFonts w:hint="eastAsia"/>
+              </w:rPr>
+              <w:t>FileContent</w:t>
+            </w:r>
+            <w:r>
+              <w:rPr>
+                <w:rFonts w:hint="eastAsia"/>
+              </w:rPr>
+              <w:t>对象。</w:t>
+            </w:r>
+          </w:p>
+          <w:p>
+            <w:pPr>
+              <w:pStyle w:val="ListParagraph"/>
+              <w:numPr>
+                <w:ilvl w:val="0"/>
+                <w:numId w:val="26"/>
+              </w:numPr>
+              <w:ind w:firstLineChars="0"/>
+              <w:rPr>
+                <w:rFonts w:hint="eastAsia"/>
+              </w:rPr>
+            </w:pPr>
+            <w:r>
+              <w:rPr>
+                <w:rFonts w:hint="eastAsia"/>
+              </w:rPr>
+              <w:t>调用</w:t>
+            </w:r>
+            <w:r>
+              <w:rPr>
+                <w:rFonts w:hint="eastAsia"/>
+              </w:rPr>
+              <w:t>getLength()</w:t>
             </w:r>
             <w:r>
               <w:rPr>
@@ -1938,18 +2607,34 @@
               <w:rPr>
                 <w:rFonts w:hint="eastAsia"/>
               </w:rPr>
-              <w:t>：文件成功从远程主机拷贝到本地主机</w:t>
-            </w:r>
-          </w:p>
-          <w:p>
-            <w:pPr>
-              <w:ind w:left="0"/>
-            </w:pPr>
-            <w:r>
+              <w:t>：成功获取</w:t>
+            </w:r>
+            <w:r>
+              <w:rPr>
+                <w:rFonts w:hint="eastAsia"/>
+              </w:rPr>
+              <w:t>FileContent</w:t>
+            </w:r>
+            <w:r>
+              <w:rPr>
+                <w:rFonts w:hint="eastAsia"/>
+              </w:rPr>
+              <w:t>二进制流长度</w:t>
+            </w:r>
+          </w:p>
+          <w:p>
+            <w:pPr>
+              <w:ind w:left="0"/>
               <w:rPr>
                 <w:rFonts w:hint="eastAsia"/>
                 <w:b/>
               </w:rPr>
+            </w:pPr>
+            <w:r>
+              <w:rPr>
+                <w:rFonts w:hint="eastAsia"/>
+                <w:b/>
+              </w:rPr>
               <w:t>失败</w:t>
             </w:r>
             <w:r>
@@ -1968,7 +2653,410 @@
               <w:rPr>
                 <w:rFonts w:hint="eastAsia"/>
               </w:rPr>
+              <w:t>抛异常和具体错误细节</w:t>
+            </w:r>
+          </w:p>
+        </w:tc>
+      </w:tr>
+      <w:tr>
+        <w:tc>
+          <w:tcPr>
+            <w:tcW w:w="2492" w:type="dxa"/>
+          </w:tcPr>
+          <w:p>
+            <w:pPr>
+              <w:ind w:left="0"/>
+              <w:rPr>
+                <w:rFonts w:hint="eastAsia"/>
+              </w:rPr>
+            </w:pPr>
+            <w:r>
+              <w:rPr>
+                <w:rFonts w:hint="eastAsia"/>
+              </w:rPr>
+              <w:t>Story.sdb.jsObject 003.004</w:t>
+            </w:r>
+          </w:p>
+        </w:tc>
+        <w:tc>
+          <w:tcPr>
+            <w:tcW w:w="1647" w:type="dxa"/>
+          </w:tcPr>
+          <w:p>
+            <w:pPr>
+              <w:ind w:left="0"/>
+              <w:rPr>
+                <w:rFonts w:hint="eastAsia"/>
+              </w:rPr>
+            </w:pPr>
+            <w:r>
+              <w:rPr>
+                <w:rFonts w:hint="eastAsia"/>
+              </w:rPr>
+              <w:t>toBase64Code</w:t>
+            </w:r>
+            <w:r>
+              <w:rPr>
+                <w:rFonts w:hint="eastAsia"/>
+              </w:rPr>
+              <w:t>功能测试</w:t>
+            </w:r>
+          </w:p>
+        </w:tc>
+        <w:tc>
+          <w:tcPr>
+            <w:tcW w:w="2336" w:type="dxa"/>
+          </w:tcPr>
+          <w:p>
+            <w:pPr>
+              <w:pStyle w:val="ListParagraph"/>
+              <w:numPr>
+                <w:ilvl w:val="0"/>
+                <w:numId w:val="27"/>
+              </w:numPr>
+              <w:ind w:firstLineChars="0"/>
+              <w:rPr>
+                <w:rFonts w:hint="eastAsia"/>
+              </w:rPr>
+            </w:pPr>
+            <w:r>
+              <w:rPr>
+                <w:rFonts w:hint="eastAsia"/>
+              </w:rPr>
+              <w:t>创建</w:t>
+            </w:r>
+            <w:r>
+              <w:rPr>
+                <w:rFonts w:hint="eastAsia"/>
+              </w:rPr>
+              <w:t>File</w:t>
+            </w:r>
+            <w:r>
+              <w:rPr>
+                <w:rFonts w:hint="eastAsia"/>
+              </w:rPr>
+              <w:t>对象。</w:t>
+            </w:r>
+          </w:p>
+          <w:p>
+            <w:pPr>
+              <w:pStyle w:val="ListParagraph"/>
+              <w:numPr>
+                <w:ilvl w:val="0"/>
+                <w:numId w:val="27"/>
+              </w:numPr>
+              <w:ind w:firstLineChars="0"/>
+              <w:rPr>
+                <w:rFonts w:hint="eastAsia"/>
+              </w:rPr>
+            </w:pPr>
+            <w:r>
+              <w:rPr>
+                <w:rFonts w:hint="eastAsia"/>
+              </w:rPr>
+              <w:t>调用</w:t>
+            </w:r>
+            <w:r>
+              <w:rPr>
+                <w:rFonts w:hint="eastAsia"/>
+              </w:rPr>
+              <w:t>readContent()</w:t>
+            </w:r>
+            <w:r>
+              <w:rPr>
+                <w:rFonts w:hint="eastAsia"/>
+              </w:rPr>
+              <w:t>获得</w:t>
+            </w:r>
+            <w:r>
+              <w:rPr>
+                <w:rFonts w:hint="eastAsia"/>
+              </w:rPr>
+              <w:t>FileContent</w:t>
+            </w:r>
+            <w:r>
+              <w:rPr>
+                <w:rFonts w:hint="eastAsia"/>
+              </w:rPr>
+              <w:t>对象。</w:t>
+            </w:r>
+          </w:p>
+          <w:p>
+            <w:pPr>
+              <w:pStyle w:val="ListParagraph"/>
+              <w:numPr>
+                <w:ilvl w:val="0"/>
+                <w:numId w:val="27"/>
+              </w:numPr>
+              <w:ind w:firstLineChars="0"/>
+              <w:rPr>
+                <w:rFonts w:hint="eastAsia"/>
+              </w:rPr>
+            </w:pPr>
+            <w:r>
+              <w:rPr>
+                <w:rFonts w:hint="eastAsia"/>
+              </w:rPr>
+              <w:lastRenderedPageBreak/>
+              <w:t>调用</w:t>
+            </w:r>
+            <w:r>
+              <w:rPr>
+                <w:rFonts w:hint="eastAsia"/>
+              </w:rPr>
+              <w:t>toBase64Code</w:t>
+            </w:r>
+            <w:r>
+              <w:rPr>
+                <w:rFonts w:hint="eastAsia"/>
+              </w:rPr>
+              <w:t>方法。</w:t>
+            </w:r>
+          </w:p>
+        </w:tc>
+        <w:tc>
+          <w:tcPr>
+            <w:tcW w:w="1690" w:type="dxa"/>
+          </w:tcPr>
+          <w:p>
+            <w:pPr>
+              <w:ind w:left="0"/>
+            </w:pPr>
+            <w:r>
+              <w:rPr>
+                <w:rFonts w:hint="eastAsia"/>
+                <w:b/>
+              </w:rPr>
+              <w:lastRenderedPageBreak/>
+              <w:t>成功</w:t>
+            </w:r>
+            <w:r>
+              <w:rPr>
+                <w:rFonts w:hint="eastAsia"/>
+              </w:rPr>
+              <w:t>：</w:t>
+            </w:r>
+            <w:r>
+              <w:rPr>
+                <w:rFonts w:hint="eastAsia"/>
+              </w:rPr>
+              <w:t>成功将二进制内容转存</w:t>
+            </w:r>
+            <w:r>
+              <w:rPr>
+                <w:rFonts w:hint="eastAsia"/>
+              </w:rPr>
+              <w:t>base64</w:t>
+            </w:r>
+            <w:r>
+              <w:rPr>
+                <w:rFonts w:hint="eastAsia"/>
+              </w:rPr>
+              <w:t>输出。</w:t>
+            </w:r>
+          </w:p>
+          <w:p>
+            <w:pPr>
+              <w:ind w:left="0"/>
+              <w:rPr>
+                <w:rFonts w:hint="eastAsia"/>
+                <w:b/>
+              </w:rPr>
+            </w:pPr>
+            <w:r>
+              <w:rPr>
+                <w:rFonts w:hint="eastAsia"/>
+                <w:b/>
+              </w:rPr>
+              <w:t>失败</w:t>
+            </w:r>
+            <w:r>
+              <w:rPr>
+                <w:rFonts w:hint="eastAsia"/>
+              </w:rPr>
+              <w:t>：</w:t>
+            </w:r>
+            <w:r>
+              <w:rPr>
+                <w:rFonts w:hint="eastAsia"/>
+              </w:rPr>
+              <w:t xml:space="preserve"> </w:t>
+            </w:r>
+            <w:r>
+              <w:rPr>
+                <w:rFonts w:hint="eastAsia"/>
+              </w:rPr>
               <w:t>抛异常和</w:t>
+            </w:r>
+            <w:r>
+              <w:rPr>
+                <w:rFonts w:hint="eastAsia"/>
+              </w:rPr>
+              <w:lastRenderedPageBreak/>
+              <w:t>具体错误细节</w:t>
+            </w:r>
+          </w:p>
+        </w:tc>
+      </w:tr>
+      <w:tr>
+        <w:tc>
+          <w:tcPr>
+            <w:tcW w:w="2492" w:type="dxa"/>
+          </w:tcPr>
+          <w:p>
+            <w:pPr>
+              <w:ind w:left="0"/>
+            </w:pPr>
+            <w:r>
+              <w:rPr>
+                <w:rFonts w:hint="eastAsia"/>
+              </w:rPr>
+              <w:lastRenderedPageBreak/>
+              <w:t>Story.sdb.jsObject 003.</w:t>
+            </w:r>
+            <w:r>
+              <w:rPr>
+                <w:rFonts w:hint="eastAsia"/>
+              </w:rPr>
+              <w:t>00</w:t>
+            </w:r>
+            <w:r>
+              <w:rPr>
+                <w:rFonts w:hint="eastAsia"/>
+              </w:rPr>
+              <w:t>5</w:t>
+            </w:r>
+          </w:p>
+        </w:tc>
+        <w:tc>
+          <w:tcPr>
+            <w:tcW w:w="1647" w:type="dxa"/>
+          </w:tcPr>
+          <w:p>
+            <w:pPr>
+              <w:ind w:left="0"/>
+            </w:pPr>
+            <w:r>
+              <w:rPr>
+                <w:rFonts w:hint="eastAsia"/>
+              </w:rPr>
+              <w:t>scp</w:t>
+            </w:r>
+            <w:r>
+              <w:rPr>
+                <w:rFonts w:hint="eastAsia"/>
+              </w:rPr>
+              <w:t>功能测试</w:t>
+            </w:r>
+          </w:p>
+        </w:tc>
+        <w:tc>
+          <w:tcPr>
+            <w:tcW w:w="2336" w:type="dxa"/>
+          </w:tcPr>
+          <w:p>
+            <w:pPr>
+              <w:pStyle w:val="ListParagraph"/>
+              <w:numPr>
+                <w:ilvl w:val="0"/>
+                <w:numId w:val="21"/>
+              </w:numPr>
+              <w:ind w:firstLineChars="0"/>
+            </w:pPr>
+            <w:r>
+              <w:rPr>
+                <w:rFonts w:hint="eastAsia"/>
+              </w:rPr>
+              <w:t>调用</w:t>
+            </w:r>
+            <w:r>
+              <w:rPr>
+                <w:rFonts w:hint="eastAsia"/>
+              </w:rPr>
+              <w:t>File.scp()</w:t>
+            </w:r>
+            <w:r>
+              <w:rPr>
+                <w:rFonts w:hint="eastAsia"/>
+              </w:rPr>
+              <w:t>拷贝文件</w:t>
+            </w:r>
+          </w:p>
+        </w:tc>
+        <w:tc>
+          <w:tcPr>
+            <w:tcW w:w="1690" w:type="dxa"/>
+          </w:tcPr>
+          <w:p>
+            <w:pPr>
+              <w:ind w:left="0"/>
+            </w:pPr>
+            <w:r>
+              <w:rPr>
+                <w:rFonts w:hint="eastAsia"/>
+                <w:b/>
+              </w:rPr>
+              <w:t>成功</w:t>
+            </w:r>
+            <w:r>
+              <w:rPr>
+                <w:rFonts w:hint="eastAsia"/>
+              </w:rPr>
+              <w:t>：</w:t>
+            </w:r>
+            <w:r>
+              <w:rPr>
+                <w:rFonts w:hint="eastAsia"/>
+              </w:rPr>
+              <w:t>文件成功从</w:t>
+            </w:r>
+            <w:r>
+              <w:rPr>
+                <w:rFonts w:hint="eastAsia"/>
+              </w:rPr>
+              <w:t>源路径拷贝到目的路径</w:t>
+            </w:r>
+          </w:p>
+          <w:p>
+            <w:pPr>
+              <w:ind w:left="0"/>
+            </w:pPr>
+            <w:r>
+              <w:rPr>
+                <w:rFonts w:hint="eastAsia"/>
+                <w:b/>
+              </w:rPr>
+              <w:t>失败</w:t>
+            </w:r>
+            <w:r>
+              <w:rPr>
+                <w:rFonts w:hint="eastAsia"/>
+              </w:rPr>
+              <w:t>：</w:t>
+            </w:r>
+            <w:r>
+              <w:rPr>
+                <w:rFonts w:hint="eastAsia"/>
+              </w:rPr>
+              <w:t xml:space="preserve"> </w:t>
+            </w:r>
+            <w:r>
+              <w:rPr>
+                <w:rFonts w:hint="eastAsia"/>
+              </w:rPr>
+              <w:t>抛</w:t>
+            </w:r>
+            <w:r>
+              <w:rPr>
+                <w:rFonts w:hint="eastAsia"/>
+              </w:rPr>
+              <w:t>异常</w:t>
+            </w:r>
+            <w:r>
+              <w:rPr>
+                <w:rFonts w:hint="eastAsia"/>
+              </w:rPr>
+              <w:t>和</w:t>
             </w:r>
             <w:r>
               <w:rPr>
@@ -2422,7 +3510,6 @@
               <w:rPr>
                 <w:rFonts w:hint="eastAsia"/>
               </w:rPr>
-              <w:lastRenderedPageBreak/>
               <w:t>sdb shell</w:t>
             </w:r>
             <w:r>
@@ -2596,6 +3683,95 @@
     </w:lvl>
   </w:abstractNum>
   <w:abstractNum w:abstractNumId="1">
+    <w:nsid w:val="1DD122D5"/>
+    <w:multiLevelType w:val="hybridMultilevel"/>
+    <w:tmpl w:val="3338448C"/>
+    <w:lvl w:ilvl="0" w:tplc="CAA6CD50">
+      <w:start w:val="1"/>
+      <w:numFmt w:val="decimal"/>
+      <w:lvlText w:val="%1."/>
+      <w:lvlJc w:val="left"/>
+      <w:pPr>
+        <w:ind w:left="360" w:hanging="360"/>
+      </w:pPr>
+      <w:rPr>
+        <w:rFonts w:hint="default"/>
+      </w:rPr>
+    </w:lvl>
+    <w:lvl w:ilvl="1" w:tplc="04090019" w:tentative="1">
+      <w:start w:val="1"/>
+      <w:numFmt w:val="lowerLetter"/>
+      <w:lvlText w:val="%2)"/>
+      <w:lvlJc w:val="left"/>
+      <w:pPr>
+        <w:ind w:left="840" w:hanging="420"/>
+      </w:pPr>
+    </w:lvl>
+    <w:lvl w:ilvl="2" w:tplc="0409001B" w:tentative="1">
+      <w:start w:val="1"/>
+      <w:numFmt w:val="lowerRoman"/>
+      <w:lvlText w:val="%3."/>
+      <w:lvlJc w:val="right"/>
+      <w:pPr>
+        <w:ind w:left="1260" w:hanging="420"/>
+      </w:pPr>
+    </w:lvl>
+    <w:lvl w:ilvl="3" w:tplc="0409000F" w:tentative="1">
+      <w:start w:val="1"/>
+      <w:numFmt w:val="decimal"/>
+      <w:lvlText w:val="%4."/>
+      <w:lvlJc w:val="left"/>
+      <w:pPr>
+        <w:ind w:left="1680" w:hanging="420"/>
+      </w:pPr>
+    </w:lvl>
+    <w:lvl w:ilvl="4" w:tplc="04090019" w:tentative="1">
+      <w:start w:val="1"/>
+      <w:numFmt w:val="lowerLetter"/>
+      <w:lvlText w:val="%5)"/>
+      <w:lvlJc w:val="left"/>
+      <w:pPr>
+        <w:ind w:left="2100" w:hanging="420"/>
+      </w:pPr>
+    </w:lvl>
+    <w:lvl w:ilvl="5" w:tplc="0409001B" w:tentative="1">
+      <w:start w:val="1"/>
+      <w:numFmt w:val="lowerRoman"/>
+      <w:lvlText w:val="%6."/>
+      <w:lvlJc w:val="right"/>
+      <w:pPr>
+        <w:ind w:left="2520" w:hanging="420"/>
+      </w:pPr>
+    </w:lvl>
+    <w:lvl w:ilvl="6" w:tplc="0409000F" w:tentative="1">
+      <w:start w:val="1"/>
+      <w:numFmt w:val="decimal"/>
+      <w:lvlText w:val="%7."/>
+      <w:lvlJc w:val="left"/>
+      <w:pPr>
+        <w:ind w:left="2940" w:hanging="420"/>
+      </w:pPr>
+    </w:lvl>
+    <w:lvl w:ilvl="7" w:tplc="04090019" w:tentative="1">
+      <w:start w:val="1"/>
+      <w:numFmt w:val="lowerLetter"/>
+      <w:lvlText w:val="%8)"/>
+      <w:lvlJc w:val="left"/>
+      <w:pPr>
+        <w:ind w:left="3360" w:hanging="420"/>
+      </w:pPr>
+    </w:lvl>
+    <w:lvl w:ilvl="8" w:tplc="0409001B" w:tentative="1">
+      <w:start w:val="1"/>
+      <w:numFmt w:val="lowerRoman"/>
+      <w:lvlText w:val="%9."/>
+      <w:lvlJc w:val="right"/>
+      <w:pPr>
+        <w:ind w:left="3780" w:hanging="420"/>
+      </w:pPr>
+    </w:lvl>
+  </w:abstractNum>
+  <w:abstractNum w:abstractNumId="2">
     <w:nsid w:val="21E22046"/>
     <w:multiLevelType w:val="hybridMultilevel"/>
     <w:tmpl w:val="CFF21BC2"/>
@@ -2681,7 +3857,7 @@
       </w:pPr>
     </w:lvl>
   </w:abstractNum>
-  <w:abstractNum w:abstractNumId="2">
+  <w:abstractNum w:abstractNumId="3">
     <w:nsid w:val="22501AA3"/>
     <w:multiLevelType w:val="hybridMultilevel"/>
     <w:tmpl w:val="1B2A9E7A"/>
@@ -2768,7 +3944,7 @@
       </w:pPr>
     </w:lvl>
   </w:abstractNum>
-  <w:abstractNum w:abstractNumId="3">
+  <w:abstractNum w:abstractNumId="4">
     <w:nsid w:val="23EC5C36"/>
     <w:multiLevelType w:val="hybridMultilevel"/>
     <w:tmpl w:val="3338448C"/>
@@ -2857,7 +4033,96 @@
       </w:pPr>
     </w:lvl>
   </w:abstractNum>
-  <w:abstractNum w:abstractNumId="4">
+  <w:abstractNum w:abstractNumId="5">
+    <w:nsid w:val="2B8B4177"/>
+    <w:multiLevelType w:val="hybridMultilevel"/>
+    <w:tmpl w:val="469EA98E"/>
+    <w:lvl w:ilvl="0" w:tplc="CAA6CD50">
+      <w:start w:val="1"/>
+      <w:numFmt w:val="decimal"/>
+      <w:lvlText w:val="%1."/>
+      <w:lvlJc w:val="left"/>
+      <w:pPr>
+        <w:ind w:left="360" w:hanging="360"/>
+      </w:pPr>
+      <w:rPr>
+        <w:rFonts w:hint="default"/>
+      </w:rPr>
+    </w:lvl>
+    <w:lvl w:ilvl="1" w:tplc="04090019" w:tentative="1">
+      <w:start w:val="1"/>
+      <w:numFmt w:val="lowerLetter"/>
+      <w:lvlText w:val="%2)"/>
+      <w:lvlJc w:val="left"/>
+      <w:pPr>
+        <w:ind w:left="840" w:hanging="420"/>
+      </w:pPr>
+    </w:lvl>
+    <w:lvl w:ilvl="2" w:tplc="0409001B" w:tentative="1">
+      <w:start w:val="1"/>
+      <w:numFmt w:val="lowerRoman"/>
+      <w:lvlText w:val="%3."/>
+      <w:lvlJc w:val="right"/>
+      <w:pPr>
+        <w:ind w:left="1260" w:hanging="420"/>
+      </w:pPr>
+    </w:lvl>
+    <w:lvl w:ilvl="3" w:tplc="0409000F" w:tentative="1">
+      <w:start w:val="1"/>
+      <w:numFmt w:val="decimal"/>
+      <w:lvlText w:val="%4."/>
+      <w:lvlJc w:val="left"/>
+      <w:pPr>
+        <w:ind w:left="1680" w:hanging="420"/>
+      </w:pPr>
+    </w:lvl>
+    <w:lvl w:ilvl="4" w:tplc="04090019" w:tentative="1">
+      <w:start w:val="1"/>
+      <w:numFmt w:val="lowerLetter"/>
+      <w:lvlText w:val="%5)"/>
+      <w:lvlJc w:val="left"/>
+      <w:pPr>
+        <w:ind w:left="2100" w:hanging="420"/>
+      </w:pPr>
+    </w:lvl>
+    <w:lvl w:ilvl="5" w:tplc="0409001B" w:tentative="1">
+      <w:start w:val="1"/>
+      <w:numFmt w:val="lowerRoman"/>
+      <w:lvlText w:val="%6."/>
+      <w:lvlJc w:val="right"/>
+      <w:pPr>
+        <w:ind w:left="2520" w:hanging="420"/>
+      </w:pPr>
+    </w:lvl>
+    <w:lvl w:ilvl="6" w:tplc="0409000F" w:tentative="1">
+      <w:start w:val="1"/>
+      <w:numFmt w:val="decimal"/>
+      <w:lvlText w:val="%7."/>
+      <w:lvlJc w:val="left"/>
+      <w:pPr>
+        <w:ind w:left="2940" w:hanging="420"/>
+      </w:pPr>
+    </w:lvl>
+    <w:lvl w:ilvl="7" w:tplc="04090019" w:tentative="1">
+      <w:start w:val="1"/>
+      <w:numFmt w:val="lowerLetter"/>
+      <w:lvlText w:val="%8)"/>
+      <w:lvlJc w:val="left"/>
+      <w:pPr>
+        <w:ind w:left="3360" w:hanging="420"/>
+      </w:pPr>
+    </w:lvl>
+    <w:lvl w:ilvl="8" w:tplc="0409001B" w:tentative="1">
+      <w:start w:val="1"/>
+      <w:numFmt w:val="lowerRoman"/>
+      <w:lvlText w:val="%9."/>
+      <w:lvlJc w:val="right"/>
+      <w:pPr>
+        <w:ind w:left="3780" w:hanging="420"/>
+      </w:pPr>
+    </w:lvl>
+  </w:abstractNum>
+  <w:abstractNum w:abstractNumId="6">
     <w:nsid w:val="2E3608C2"/>
     <w:multiLevelType w:val="hybridMultilevel"/>
     <w:tmpl w:val="5E845FCA"/>
@@ -2943,7 +4208,7 @@
       </w:pPr>
     </w:lvl>
   </w:abstractNum>
-  <w:abstractNum w:abstractNumId="5">
+  <w:abstractNum w:abstractNumId="7">
     <w:nsid w:val="33FF7C5C"/>
     <w:multiLevelType w:val="hybridMultilevel"/>
     <w:tmpl w:val="3338448C"/>
@@ -3032,7 +4297,96 @@
       </w:pPr>
     </w:lvl>
   </w:abstractNum>
-  <w:abstractNum w:abstractNumId="6">
+  <w:abstractNum w:abstractNumId="8">
+    <w:nsid w:val="3951146B"/>
+    <w:multiLevelType w:val="hybridMultilevel"/>
+    <w:tmpl w:val="D49AA74A"/>
+    <w:lvl w:ilvl="0" w:tplc="CAA6CD50">
+      <w:start w:val="1"/>
+      <w:numFmt w:val="decimal"/>
+      <w:lvlText w:val="%1."/>
+      <w:lvlJc w:val="left"/>
+      <w:pPr>
+        <w:ind w:left="360" w:hanging="360"/>
+      </w:pPr>
+      <w:rPr>
+        <w:rFonts w:hint="default"/>
+      </w:rPr>
+    </w:lvl>
+    <w:lvl w:ilvl="1" w:tplc="04090019" w:tentative="1">
+      <w:start w:val="1"/>
+      <w:numFmt w:val="lowerLetter"/>
+      <w:lvlText w:val="%2)"/>
+      <w:lvlJc w:val="left"/>
+      <w:pPr>
+        <w:ind w:left="840" w:hanging="420"/>
+      </w:pPr>
+    </w:lvl>
+    <w:lvl w:ilvl="2" w:tplc="0409001B" w:tentative="1">
+      <w:start w:val="1"/>
+      <w:numFmt w:val="lowerRoman"/>
+      <w:lvlText w:val="%3."/>
+      <w:lvlJc w:val="right"/>
+      <w:pPr>
+        <w:ind w:left="1260" w:hanging="420"/>
+      </w:pPr>
+    </w:lvl>
+    <w:lvl w:ilvl="3" w:tplc="0409000F" w:tentative="1">
+      <w:start w:val="1"/>
+      <w:numFmt w:val="decimal"/>
+      <w:lvlText w:val="%4."/>
+      <w:lvlJc w:val="left"/>
+      <w:pPr>
+        <w:ind w:left="1680" w:hanging="420"/>
+      </w:pPr>
+    </w:lvl>
+    <w:lvl w:ilvl="4" w:tplc="04090019" w:tentative="1">
+      <w:start w:val="1"/>
+      <w:numFmt w:val="lowerLetter"/>
+      <w:lvlText w:val="%5)"/>
+      <w:lvlJc w:val="left"/>
+      <w:pPr>
+        <w:ind w:left="2100" w:hanging="420"/>
+      </w:pPr>
+    </w:lvl>
+    <w:lvl w:ilvl="5" w:tplc="0409001B" w:tentative="1">
+      <w:start w:val="1"/>
+      <w:numFmt w:val="lowerRoman"/>
+      <w:lvlText w:val="%6."/>
+      <w:lvlJc w:val="right"/>
+      <w:pPr>
+        <w:ind w:left="2520" w:hanging="420"/>
+      </w:pPr>
+    </w:lvl>
+    <w:lvl w:ilvl="6" w:tplc="0409000F" w:tentative="1">
+      <w:start w:val="1"/>
+      <w:numFmt w:val="decimal"/>
+      <w:lvlText w:val="%7."/>
+      <w:lvlJc w:val="left"/>
+      <w:pPr>
+        <w:ind w:left="2940" w:hanging="420"/>
+      </w:pPr>
+    </w:lvl>
+    <w:lvl w:ilvl="7" w:tplc="04090019" w:tentative="1">
+      <w:start w:val="1"/>
+      <w:numFmt w:val="lowerLetter"/>
+      <w:lvlText w:val="%8)"/>
+      <w:lvlJc w:val="left"/>
+      <w:pPr>
+        <w:ind w:left="3360" w:hanging="420"/>
+      </w:pPr>
+    </w:lvl>
+    <w:lvl w:ilvl="8" w:tplc="0409001B" w:tentative="1">
+      <w:start w:val="1"/>
+      <w:numFmt w:val="lowerRoman"/>
+      <w:lvlText w:val="%9."/>
+      <w:lvlJc w:val="right"/>
+      <w:pPr>
+        <w:ind w:left="3780" w:hanging="420"/>
+      </w:pPr>
+    </w:lvl>
+  </w:abstractNum>
+  <w:abstractNum w:abstractNumId="9">
     <w:nsid w:val="3A115634"/>
     <w:multiLevelType w:val="hybridMultilevel"/>
     <w:tmpl w:val="CE2AA74E"/>
@@ -3118,7 +4472,120 @@
       </w:pPr>
     </w:lvl>
   </w:abstractNum>
-  <w:abstractNum w:abstractNumId="7">
+  <w:abstractNum w:abstractNumId="10">
+    <w:nsid w:val="471F2CA2"/>
+    <w:multiLevelType w:val="hybridMultilevel"/>
+    <w:tmpl w:val="E35008D4"/>
+    <w:lvl w:ilvl="0" w:tplc="0409000B">
+      <w:start w:val="1"/>
+      <w:numFmt w:val="bullet"/>
+      <w:lvlText w:val=""/>
+      <w:lvlJc w:val="left"/>
+      <w:pPr>
+        <w:ind w:left="1197" w:hanging="420"/>
+      </w:pPr>
+      <w:rPr>
+        <w:rFonts w:ascii="Wingdings" w:hAnsi="Wingdings" w:hint="default"/>
+      </w:rPr>
+    </w:lvl>
+    <w:lvl w:ilvl="1" w:tplc="04090003" w:tentative="1">
+      <w:start w:val="1"/>
+      <w:numFmt w:val="bullet"/>
+      <w:lvlText w:val=""/>
+      <w:lvlJc w:val="left"/>
+      <w:pPr>
+        <w:ind w:left="1617" w:hanging="420"/>
+      </w:pPr>
+      <w:rPr>
+        <w:rFonts w:ascii="Wingdings" w:hAnsi="Wingdings" w:hint="default"/>
+      </w:rPr>
+    </w:lvl>
+    <w:lvl w:ilvl="2" w:tplc="04090005" w:tentative="1">
+      <w:start w:val="1"/>
+      <w:numFmt w:val="bullet"/>
+      <w:lvlText w:val=""/>
+      <w:lvlJc w:val="left"/>
+      <w:pPr>
+        <w:ind w:left="2037" w:hanging="420"/>
+      </w:pPr>
+      <w:rPr>
+        <w:rFonts w:ascii="Wingdings" w:hAnsi="Wingdings" w:hint="default"/>
+      </w:rPr>
+    </w:lvl>
+    <w:lvl w:ilvl="3" w:tplc="04090001" w:tentative="1">
+      <w:start w:val="1"/>
+      <w:numFmt w:val="bullet"/>
+      <w:lvlText w:val=""/>
+      <w:lvlJc w:val="left"/>
+      <w:pPr>
+        <w:ind w:left="2457" w:hanging="420"/>
+      </w:pPr>
+      <w:rPr>
+        <w:rFonts w:ascii="Wingdings" w:hAnsi="Wingdings" w:hint="default"/>
+      </w:rPr>
+    </w:lvl>
+    <w:lvl w:ilvl="4" w:tplc="04090003" w:tentative="1">
+      <w:start w:val="1"/>
+      <w:numFmt w:val="bullet"/>
+      <w:lvlText w:val=""/>
+      <w:lvlJc w:val="left"/>
+      <w:pPr>
+        <w:ind w:left="2877" w:hanging="420"/>
+      </w:pPr>
+      <w:rPr>
+        <w:rFonts w:ascii="Wingdings" w:hAnsi="Wingdings" w:hint="default"/>
+      </w:rPr>
+    </w:lvl>
+    <w:lvl w:ilvl="5" w:tplc="04090005" w:tentative="1">
+      <w:start w:val="1"/>
+      <w:numFmt w:val="bullet"/>
+      <w:lvlText w:val=""/>
+      <w:lvlJc w:val="left"/>
+      <w:pPr>
+        <w:ind w:left="3297" w:hanging="420"/>
+      </w:pPr>
+      <w:rPr>
+        <w:rFonts w:ascii="Wingdings" w:hAnsi="Wingdings" w:hint="default"/>
+      </w:rPr>
+    </w:lvl>
+    <w:lvl w:ilvl="6" w:tplc="04090001" w:tentative="1">
+      <w:start w:val="1"/>
+      <w:numFmt w:val="bullet"/>
+      <w:lvlText w:val=""/>
+      <w:lvlJc w:val="left"/>
+      <w:pPr>
+        <w:ind w:left="3717" w:hanging="420"/>
+      </w:pPr>
+      <w:rPr>
+        <w:rFonts w:ascii="Wingdings" w:hAnsi="Wingdings" w:hint="default"/>
+      </w:rPr>
+    </w:lvl>
+    <w:lvl w:ilvl="7" w:tplc="04090003" w:tentative="1">
+      <w:start w:val="1"/>
+      <w:numFmt w:val="bullet"/>
+      <w:lvlText w:val=""/>
+      <w:lvlJc w:val="left"/>
+      <w:pPr>
+        <w:ind w:left="4137" w:hanging="420"/>
+      </w:pPr>
+      <w:rPr>
+        <w:rFonts w:ascii="Wingdings" w:hAnsi="Wingdings" w:hint="default"/>
+      </w:rPr>
+    </w:lvl>
+    <w:lvl w:ilvl="8" w:tplc="04090005" w:tentative="1">
+      <w:start w:val="1"/>
+      <w:numFmt w:val="bullet"/>
+      <w:lvlText w:val=""/>
+      <w:lvlJc w:val="left"/>
+      <w:pPr>
+        <w:ind w:left="4557" w:hanging="420"/>
+      </w:pPr>
+      <w:rPr>
+        <w:rFonts w:ascii="Wingdings" w:hAnsi="Wingdings" w:hint="default"/>
+      </w:rPr>
+    </w:lvl>
+  </w:abstractNum>
+  <w:abstractNum w:abstractNumId="11">
     <w:nsid w:val="48286AA2"/>
     <w:multiLevelType w:val="hybridMultilevel"/>
     <w:tmpl w:val="08E0BC12"/>
@@ -3231,7 +4698,7 @@
       </w:rPr>
     </w:lvl>
   </w:abstractNum>
-  <w:abstractNum w:abstractNumId="8">
+  <w:abstractNum w:abstractNumId="12">
     <w:nsid w:val="4E18475E"/>
     <w:multiLevelType w:val="hybridMultilevel"/>
     <w:tmpl w:val="2D08D204"/>
@@ -3346,7 +4813,96 @@
       </w:rPr>
     </w:lvl>
   </w:abstractNum>
-  <w:abstractNum w:abstractNumId="9">
+  <w:abstractNum w:abstractNumId="13">
+    <w:nsid w:val="4EA71A12"/>
+    <w:multiLevelType w:val="hybridMultilevel"/>
+    <w:tmpl w:val="D49AA74A"/>
+    <w:lvl w:ilvl="0" w:tplc="CAA6CD50">
+      <w:start w:val="1"/>
+      <w:numFmt w:val="decimal"/>
+      <w:lvlText w:val="%1."/>
+      <w:lvlJc w:val="left"/>
+      <w:pPr>
+        <w:ind w:left="360" w:hanging="360"/>
+      </w:pPr>
+      <w:rPr>
+        <w:rFonts w:hint="default"/>
+      </w:rPr>
+    </w:lvl>
+    <w:lvl w:ilvl="1" w:tplc="04090019" w:tentative="1">
+      <w:start w:val="1"/>
+      <w:numFmt w:val="lowerLetter"/>
+      <w:lvlText w:val="%2)"/>
+      <w:lvlJc w:val="left"/>
+      <w:pPr>
+        <w:ind w:left="840" w:hanging="420"/>
+      </w:pPr>
+    </w:lvl>
+    <w:lvl w:ilvl="2" w:tplc="0409001B" w:tentative="1">
+      <w:start w:val="1"/>
+      <w:numFmt w:val="lowerRoman"/>
+      <w:lvlText w:val="%3."/>
+      <w:lvlJc w:val="right"/>
+      <w:pPr>
+        <w:ind w:left="1260" w:hanging="420"/>
+      </w:pPr>
+    </w:lvl>
+    <w:lvl w:ilvl="3" w:tplc="0409000F" w:tentative="1">
+      <w:start w:val="1"/>
+      <w:numFmt w:val="decimal"/>
+      <w:lvlText w:val="%4."/>
+      <w:lvlJc w:val="left"/>
+      <w:pPr>
+        <w:ind w:left="1680" w:hanging="420"/>
+      </w:pPr>
+    </w:lvl>
+    <w:lvl w:ilvl="4" w:tplc="04090019" w:tentative="1">
+      <w:start w:val="1"/>
+      <w:numFmt w:val="lowerLetter"/>
+      <w:lvlText w:val="%5)"/>
+      <w:lvlJc w:val="left"/>
+      <w:pPr>
+        <w:ind w:left="2100" w:hanging="420"/>
+      </w:pPr>
+    </w:lvl>
+    <w:lvl w:ilvl="5" w:tplc="0409001B" w:tentative="1">
+      <w:start w:val="1"/>
+      <w:numFmt w:val="lowerRoman"/>
+      <w:lvlText w:val="%6."/>
+      <w:lvlJc w:val="right"/>
+      <w:pPr>
+        <w:ind w:left="2520" w:hanging="420"/>
+      </w:pPr>
+    </w:lvl>
+    <w:lvl w:ilvl="6" w:tplc="0409000F" w:tentative="1">
+      <w:start w:val="1"/>
+      <w:numFmt w:val="decimal"/>
+      <w:lvlText w:val="%7."/>
+      <w:lvlJc w:val="left"/>
+      <w:pPr>
+        <w:ind w:left="2940" w:hanging="420"/>
+      </w:pPr>
+    </w:lvl>
+    <w:lvl w:ilvl="7" w:tplc="04090019" w:tentative="1">
+      <w:start w:val="1"/>
+      <w:numFmt w:val="lowerLetter"/>
+      <w:lvlText w:val="%8)"/>
+      <w:lvlJc w:val="left"/>
+      <w:pPr>
+        <w:ind w:left="3360" w:hanging="420"/>
+      </w:pPr>
+    </w:lvl>
+    <w:lvl w:ilvl="8" w:tplc="0409001B" w:tentative="1">
+      <w:start w:val="1"/>
+      <w:numFmt w:val="lowerRoman"/>
+      <w:lvlText w:val="%9."/>
+      <w:lvlJc w:val="right"/>
+      <w:pPr>
+        <w:ind w:left="3780" w:hanging="420"/>
+      </w:pPr>
+    </w:lvl>
+  </w:abstractNum>
+  <w:abstractNum w:abstractNumId="14">
     <w:nsid w:val="4F4301B5"/>
     <w:multiLevelType w:val="hybridMultilevel"/>
     <w:tmpl w:val="BF828606"/>
@@ -3437,7 +4993,7 @@
       </w:pPr>
     </w:lvl>
   </w:abstractNum>
-  <w:abstractNum w:abstractNumId="10">
+  <w:abstractNum w:abstractNumId="15">
     <w:nsid w:val="51CC4880"/>
     <w:multiLevelType w:val="hybridMultilevel"/>
     <w:tmpl w:val="2FBCBAF0"/>
@@ -3550,7 +5106,7 @@
       </w:rPr>
     </w:lvl>
   </w:abstractNum>
-  <w:abstractNum w:abstractNumId="11">
+  <w:abstractNum w:abstractNumId="16">
     <w:nsid w:val="526545E4"/>
     <w:multiLevelType w:val="hybridMultilevel"/>
     <w:tmpl w:val="F87C6732"/>
@@ -3665,7 +5221,7 @@
       </w:rPr>
     </w:lvl>
   </w:abstractNum>
-  <w:abstractNum w:abstractNumId="12">
+  <w:abstractNum w:abstractNumId="17">
     <w:nsid w:val="589E00D2"/>
     <w:multiLevelType w:val="hybridMultilevel"/>
     <w:tmpl w:val="712282AA"/>
@@ -3752,7 +5308,182 @@
       </w:pPr>
     </w:lvl>
   </w:abstractNum>
-  <w:abstractNum w:abstractNumId="13">
+  <w:abstractNum w:abstractNumId="18">
+    <w:nsid w:val="5AB40447"/>
+    <w:multiLevelType w:val="hybridMultilevel"/>
+    <w:tmpl w:val="3338448C"/>
+    <w:lvl w:ilvl="0" w:tplc="CAA6CD50">
+      <w:start w:val="1"/>
+      <w:numFmt w:val="decimal"/>
+      <w:lvlText w:val="%1."/>
+      <w:lvlJc w:val="left"/>
+      <w:pPr>
+        <w:ind w:left="360" w:hanging="360"/>
+      </w:pPr>
+      <w:rPr>
+        <w:rFonts w:hint="default"/>
+      </w:rPr>
+    </w:lvl>
+    <w:lvl w:ilvl="1" w:tplc="04090019" w:tentative="1">
+      <w:start w:val="1"/>
+      <w:numFmt w:val="lowerLetter"/>
+      <w:lvlText w:val="%2)"/>
+      <w:lvlJc w:val="left"/>
+      <w:pPr>
+        <w:ind w:left="840" w:hanging="420"/>
+      </w:pPr>
+    </w:lvl>
+    <w:lvl w:ilvl="2" w:tplc="0409001B" w:tentative="1">
+      <w:start w:val="1"/>
+      <w:numFmt w:val="lowerRoman"/>
+      <w:lvlText w:val="%3."/>
+      <w:lvlJc w:val="right"/>
+      <w:pPr>
+        <w:ind w:left="1260" w:hanging="420"/>
+      </w:pPr>
+    </w:lvl>
+    <w:lvl w:ilvl="3" w:tplc="0409000F" w:tentative="1">
+      <w:start w:val="1"/>
+      <w:numFmt w:val="decimal"/>
+      <w:lvlText w:val="%4."/>
+      <w:lvlJc w:val="left"/>
+      <w:pPr>
+        <w:ind w:left="1680" w:hanging="420"/>
+      </w:pPr>
+    </w:lvl>
+    <w:lvl w:ilvl="4" w:tplc="04090019" w:tentative="1">
+      <w:start w:val="1"/>
+      <w:numFmt w:val="lowerLetter"/>
+      <w:lvlText w:val="%5)"/>
+      <w:lvlJc w:val="left"/>
+      <w:pPr>
+        <w:ind w:left="2100" w:hanging="420"/>
+      </w:pPr>
+    </w:lvl>
+    <w:lvl w:ilvl="5" w:tplc="0409001B" w:tentative="1">
+      <w:start w:val="1"/>
+      <w:numFmt w:val="lowerRoman"/>
+      <w:lvlText w:val="%6."/>
+      <w:lvlJc w:val="right"/>
+      <w:pPr>
+        <w:ind w:left="2520" w:hanging="420"/>
+      </w:pPr>
+    </w:lvl>
+    <w:lvl w:ilvl="6" w:tplc="0409000F" w:tentative="1">
+      <w:start w:val="1"/>
+      <w:numFmt w:val="decimal"/>
+      <w:lvlText w:val="%7."/>
+      <w:lvlJc w:val="left"/>
+      <w:pPr>
+        <w:ind w:left="2940" w:hanging="420"/>
+      </w:pPr>
+    </w:lvl>
+    <w:lvl w:ilvl="7" w:tplc="04090019" w:tentative="1">
+      <w:start w:val="1"/>
+      <w:numFmt w:val="lowerLetter"/>
+      <w:lvlText w:val="%8)"/>
+      <w:lvlJc w:val="left"/>
+      <w:pPr>
+        <w:ind w:left="3360" w:hanging="420"/>
+      </w:pPr>
+    </w:lvl>
+    <w:lvl w:ilvl="8" w:tplc="0409001B" w:tentative="1">
+      <w:start w:val="1"/>
+      <w:numFmt w:val="lowerRoman"/>
+      <w:lvlText w:val="%9."/>
+      <w:lvlJc w:val="right"/>
+      <w:pPr>
+        <w:ind w:left="3780" w:hanging="420"/>
+      </w:pPr>
+    </w:lvl>
+  </w:abstractNum>
+  <w:abstractNum w:abstractNumId="19">
+    <w:nsid w:val="6AEC1DC7"/>
+    <w:multiLevelType w:val="hybridMultilevel"/>
+    <w:tmpl w:val="43CE82B2"/>
+    <w:lvl w:ilvl="0" w:tplc="0409000F">
+      <w:start w:val="1"/>
+      <w:numFmt w:val="decimal"/>
+      <w:lvlText w:val="%1."/>
+      <w:lvlJc w:val="left"/>
+      <w:pPr>
+        <w:ind w:left="1617" w:hanging="420"/>
+      </w:pPr>
+    </w:lvl>
+    <w:lvl w:ilvl="1" w:tplc="04090019" w:tentative="1">
+      <w:start w:val="1"/>
+      <w:numFmt w:val="lowerLetter"/>
+      <w:lvlText w:val="%2)"/>
+      <w:lvlJc w:val="left"/>
+      <w:pPr>
+        <w:ind w:left="2037" w:hanging="420"/>
+      </w:pPr>
+    </w:lvl>
+    <w:lvl w:ilvl="2" w:tplc="0409001B" w:tentative="1">
+      <w:start w:val="1"/>
+      <w:numFmt w:val="lowerRoman"/>
+      <w:lvlText w:val="%3."/>
+      <w:lvlJc w:val="right"/>
+      <w:pPr>
+        <w:ind w:left="2457" w:hanging="420"/>
+      </w:pPr>
+    </w:lvl>
+    <w:lvl w:ilvl="3" w:tplc="0409000F" w:tentative="1">
+      <w:start w:val="1"/>
+      <w:numFmt w:val="decimal"/>
+      <w:lvlText w:val="%4."/>
+      <w:lvlJc w:val="left"/>
+      <w:pPr>
+        <w:ind w:left="2877" w:hanging="420"/>
+      </w:pPr>
+    </w:lvl>
+    <w:lvl w:ilvl="4" w:tplc="04090019" w:tentative="1">
+      <w:start w:val="1"/>
+      <w:numFmt w:val="lowerLetter"/>
+      <w:lvlText w:val="%5)"/>
+      <w:lvlJc w:val="left"/>
+      <w:pPr>
+        <w:ind w:left="3297" w:hanging="420"/>
+      </w:pPr>
+    </w:lvl>
+    <w:lvl w:ilvl="5" w:tplc="0409001B" w:tentative="1">
+      <w:start w:val="1"/>
+      <w:numFmt w:val="lowerRoman"/>
+      <w:lvlText w:val="%6."/>
+      <w:lvlJc w:val="right"/>
+      <w:pPr>
+        <w:ind w:left="3717" w:hanging="420"/>
+      </w:pPr>
+    </w:lvl>
+    <w:lvl w:ilvl="6" w:tplc="0409000F" w:tentative="1">
+      <w:start w:val="1"/>
+      <w:numFmt w:val="decimal"/>
+      <w:lvlText w:val="%7."/>
+      <w:lvlJc w:val="left"/>
+      <w:pPr>
+        <w:ind w:left="4137" w:hanging="420"/>
+      </w:pPr>
+    </w:lvl>
+    <w:lvl w:ilvl="7" w:tplc="04090019" w:tentative="1">
+      <w:start w:val="1"/>
+      <w:numFmt w:val="lowerLetter"/>
+      <w:lvlText w:val="%8)"/>
+      <w:lvlJc w:val="left"/>
+      <w:pPr>
+        <w:ind w:left="4557" w:hanging="420"/>
+      </w:pPr>
+    </w:lvl>
+    <w:lvl w:ilvl="8" w:tplc="0409001B" w:tentative="1">
+      <w:start w:val="1"/>
+      <w:numFmt w:val="lowerRoman"/>
+      <w:lvlText w:val="%9."/>
+      <w:lvlJc w:val="right"/>
+      <w:pPr>
+        <w:ind w:left="4977" w:hanging="420"/>
+      </w:pPr>
+    </w:lvl>
+  </w:abstractNum>
+  <w:abstractNum w:abstractNumId="20">
     <w:nsid w:val="74C74E85"/>
     <w:multiLevelType w:val="hybridMultilevel"/>
     <w:tmpl w:val="3338448C"/>
@@ -3841,7 +5572,7 @@
       </w:pPr>
     </w:lvl>
   </w:abstractNum>
-  <w:abstractNum w:abstractNumId="14">
+  <w:abstractNum w:abstractNumId="21">
     <w:nsid w:val="78274998"/>
     <w:multiLevelType w:val="hybridMultilevel"/>
     <w:tmpl w:val="3662B07E"/>
@@ -3956,7 +5687,96 @@
       </w:rPr>
     </w:lvl>
   </w:abstractNum>
-  <w:abstractNum w:abstractNumId="15">
+  <w:abstractNum w:abstractNumId="22">
+    <w:nsid w:val="7B06628F"/>
+    <w:multiLevelType w:val="hybridMultilevel"/>
+    <w:tmpl w:val="3338448C"/>
+    <w:lvl w:ilvl="0" w:tplc="CAA6CD50">
+      <w:start w:val="1"/>
+      <w:numFmt w:val="decimal"/>
+      <w:lvlText w:val="%1."/>
+      <w:lvlJc w:val="left"/>
+      <w:pPr>
+        <w:ind w:left="360" w:hanging="360"/>
+      </w:pPr>
+      <w:rPr>
+        <w:rFonts w:hint="default"/>
+      </w:rPr>
+    </w:lvl>
+    <w:lvl w:ilvl="1" w:tplc="04090019" w:tentative="1">
+      <w:start w:val="1"/>
+      <w:numFmt w:val="lowerLetter"/>
+      <w:lvlText w:val="%2)"/>
+      <w:lvlJc w:val="left"/>
+      <w:pPr>
+        <w:ind w:left="840" w:hanging="420"/>
+      </w:pPr>
+    </w:lvl>
+    <w:lvl w:ilvl="2" w:tplc="0409001B" w:tentative="1">
+      <w:start w:val="1"/>
+      <w:numFmt w:val="lowerRoman"/>
+      <w:lvlText w:val="%3."/>
+      <w:lvlJc w:val="right"/>
+      <w:pPr>
+        <w:ind w:left="1260" w:hanging="420"/>
+      </w:pPr>
+    </w:lvl>
+    <w:lvl w:ilvl="3" w:tplc="0409000F" w:tentative="1">
+      <w:start w:val="1"/>
+      <w:numFmt w:val="decimal"/>
+      <w:lvlText w:val="%4."/>
+      <w:lvlJc w:val="left"/>
+      <w:pPr>
+        <w:ind w:left="1680" w:hanging="420"/>
+      </w:pPr>
+    </w:lvl>
+    <w:lvl w:ilvl="4" w:tplc="04090019" w:tentative="1">
+      <w:start w:val="1"/>
+      <w:numFmt w:val="lowerLetter"/>
+      <w:lvlText w:val="%5)"/>
+      <w:lvlJc w:val="left"/>
+      <w:pPr>
+        <w:ind w:left="2100" w:hanging="420"/>
+      </w:pPr>
+    </w:lvl>
+    <w:lvl w:ilvl="5" w:tplc="0409001B" w:tentative="1">
+      <w:start w:val="1"/>
+      <w:numFmt w:val="lowerRoman"/>
+      <w:lvlText w:val="%6."/>
+      <w:lvlJc w:val="right"/>
+      <w:pPr>
+        <w:ind w:left="2520" w:hanging="420"/>
+      </w:pPr>
+    </w:lvl>
+    <w:lvl w:ilvl="6" w:tplc="0409000F" w:tentative="1">
+      <w:start w:val="1"/>
+      <w:numFmt w:val="decimal"/>
+      <w:lvlText w:val="%7."/>
+      <w:lvlJc w:val="left"/>
+      <w:pPr>
+        <w:ind w:left="2940" w:hanging="420"/>
+      </w:pPr>
+    </w:lvl>
+    <w:lvl w:ilvl="7" w:tplc="04090019" w:tentative="1">
+      <w:start w:val="1"/>
+      <w:numFmt w:val="lowerLetter"/>
+      <w:lvlText w:val="%8)"/>
+      <w:lvlJc w:val="left"/>
+      <w:pPr>
+        <w:ind w:left="3360" w:hanging="420"/>
+      </w:pPr>
+    </w:lvl>
+    <w:lvl w:ilvl="8" w:tplc="0409001B" w:tentative="1">
+      <w:start w:val="1"/>
+      <w:numFmt w:val="lowerRoman"/>
+      <w:lvlText w:val="%9."/>
+      <w:lvlJc w:val="right"/>
+      <w:pPr>
+        <w:ind w:left="3780" w:hanging="420"/>
+      </w:pPr>
+    </w:lvl>
+  </w:abstractNum>
+  <w:abstractNum w:abstractNumId="23">
     <w:nsid w:val="7B3B65AD"/>
     <w:multiLevelType w:val="hybridMultilevel"/>
     <w:tmpl w:val="3338448C"/>
@@ -4045,59 +5865,175 @@
       </w:pPr>
     </w:lvl>
   </w:abstractNum>
+  <w:abstractNum w:abstractNumId="24">
+    <w:nsid w:val="7F7E60CC"/>
+    <w:multiLevelType w:val="hybridMultilevel"/>
+    <w:tmpl w:val="3338448C"/>
+    <w:lvl w:ilvl="0" w:tplc="CAA6CD50">
+      <w:start w:val="1"/>
+      <w:numFmt w:val="decimal"/>
+      <w:lvlText w:val="%1."/>
+      <w:lvlJc w:val="left"/>
+      <w:pPr>
+        <w:ind w:left="360" w:hanging="360"/>
+      </w:pPr>
+      <w:rPr>
+        <w:rFonts w:hint="default"/>
+      </w:rPr>
+    </w:lvl>
+    <w:lvl w:ilvl="1" w:tplc="04090019" w:tentative="1">
+      <w:start w:val="1"/>
+      <w:numFmt w:val="lowerLetter"/>
+      <w:lvlText w:val="%2)"/>
+      <w:lvlJc w:val="left"/>
+      <w:pPr>
+        <w:ind w:left="840" w:hanging="420"/>
+      </w:pPr>
+    </w:lvl>
+    <w:lvl w:ilvl="2" w:tplc="0409001B" w:tentative="1">
+      <w:start w:val="1"/>
+      <w:numFmt w:val="lowerRoman"/>
+      <w:lvlText w:val="%3."/>
+      <w:lvlJc w:val="right"/>
+      <w:pPr>
+        <w:ind w:left="1260" w:hanging="420"/>
+      </w:pPr>
+    </w:lvl>
+    <w:lvl w:ilvl="3" w:tplc="0409000F" w:tentative="1">
+      <w:start w:val="1"/>
+      <w:numFmt w:val="decimal"/>
+      <w:lvlText w:val="%4."/>
+      <w:lvlJc w:val="left"/>
+      <w:pPr>
+        <w:ind w:left="1680" w:hanging="420"/>
+      </w:pPr>
+    </w:lvl>
+    <w:lvl w:ilvl="4" w:tplc="04090019" w:tentative="1">
+      <w:start w:val="1"/>
+      <w:numFmt w:val="lowerLetter"/>
+      <w:lvlText w:val="%5)"/>
+      <w:lvlJc w:val="left"/>
+      <w:pPr>
+        <w:ind w:left="2100" w:hanging="420"/>
+      </w:pPr>
+    </w:lvl>
+    <w:lvl w:ilvl="5" w:tplc="0409001B" w:tentative="1">
+      <w:start w:val="1"/>
+      <w:numFmt w:val="lowerRoman"/>
+      <w:lvlText w:val="%6."/>
+      <w:lvlJc w:val="right"/>
+      <w:pPr>
+        <w:ind w:left="2520" w:hanging="420"/>
+      </w:pPr>
+    </w:lvl>
+    <w:lvl w:ilvl="6" w:tplc="0409000F" w:tentative="1">
+      <w:start w:val="1"/>
+      <w:numFmt w:val="decimal"/>
+      <w:lvlText w:val="%7."/>
+      <w:lvlJc w:val="left"/>
+      <w:pPr>
+        <w:ind w:left="2940" w:hanging="420"/>
+      </w:pPr>
+    </w:lvl>
+    <w:lvl w:ilvl="7" w:tplc="04090019" w:tentative="1">
+      <w:start w:val="1"/>
+      <w:numFmt w:val="lowerLetter"/>
+      <w:lvlText w:val="%8)"/>
+      <w:lvlJc w:val="left"/>
+      <w:pPr>
+        <w:ind w:left="3360" w:hanging="420"/>
+      </w:pPr>
+    </w:lvl>
+    <w:lvl w:ilvl="8" w:tplc="0409001B" w:tentative="1">
+      <w:start w:val="1"/>
+      <w:numFmt w:val="lowerRoman"/>
+      <w:lvlText w:val="%9."/>
+      <w:lvlJc w:val="right"/>
+      <w:pPr>
+        <w:ind w:left="3780" w:hanging="420"/>
+      </w:pPr>
+    </w:lvl>
+  </w:abstractNum>
   <w:num w:numId="1">
-    <w:abstractNumId w:val="2"/>
+    <w:abstractNumId w:val="3"/>
   </w:num>
   <w:num w:numId="2">
-    <w:abstractNumId w:val="12"/>
+    <w:abstractNumId w:val="17"/>
   </w:num>
   <w:num w:numId="3">
+    <w:abstractNumId w:val="4"/>
+  </w:num>
+  <w:num w:numId="4">
     <w:abstractNumId w:val="3"/>
   </w:num>
-  <w:num w:numId="4">
-    <w:abstractNumId w:val="2"/>
-  </w:num>
   <w:num w:numId="5">
-    <w:abstractNumId w:val="2"/>
+    <w:abstractNumId w:val="3"/>
   </w:num>
   <w:num w:numId="6">
-    <w:abstractNumId w:val="6"/>
+    <w:abstractNumId w:val="9"/>
   </w:num>
   <w:num w:numId="7">
     <w:abstractNumId w:val="0"/>
   </w:num>
   <w:num w:numId="8">
-    <w:abstractNumId w:val="9"/>
+    <w:abstractNumId w:val="14"/>
   </w:num>
   <w:num w:numId="9">
-    <w:abstractNumId w:val="4"/>
+    <w:abstractNumId w:val="6"/>
   </w:num>
   <w:num w:numId="10">
+    <w:abstractNumId w:val="2"/>
+  </w:num>
+  <w:num w:numId="11">
+    <w:abstractNumId w:val="20"/>
+  </w:num>
+  <w:num w:numId="12">
+    <w:abstractNumId w:val="7"/>
+  </w:num>
+  <w:num w:numId="13">
+    <w:abstractNumId w:val="23"/>
+  </w:num>
+  <w:num w:numId="14">
+    <w:abstractNumId w:val="15"/>
+  </w:num>
+  <w:num w:numId="15">
+    <w:abstractNumId w:val="12"/>
+  </w:num>
+  <w:num w:numId="16">
+    <w:abstractNumId w:val="21"/>
+  </w:num>
+  <w:num w:numId="17">
+    <w:abstractNumId w:val="16"/>
+  </w:num>
+  <w:num w:numId="18">
+    <w:abstractNumId w:val="11"/>
+  </w:num>
+  <w:num w:numId="19">
+    <w:abstractNumId w:val="10"/>
+  </w:num>
+  <w:num w:numId="20">
+    <w:abstractNumId w:val="19"/>
+  </w:num>
+  <w:num w:numId="21">
+    <w:abstractNumId w:val="18"/>
+  </w:num>
+  <w:num w:numId="22">
+    <w:abstractNumId w:val="24"/>
+  </w:num>
+  <w:num w:numId="23">
     <w:abstractNumId w:val="1"/>
   </w:num>
-  <w:num w:numId="11">
+  <w:num w:numId="24">
+    <w:abstractNumId w:val="22"/>
+  </w:num>
+  <w:num w:numId="25">
+    <w:abstractNumId w:val="5"/>
+  </w:num>
+  <w:num w:numId="26">
     <w:abstractNumId w:val="13"/>
   </w:num>
-  <w:num w:numId="12">
-    <w:abstractNumId w:val="5"/>
-  </w:num>
-  <w:num w:numId="13">
-    <w:abstractNumId w:val="15"/>
-  </w:num>
-  <w:num w:numId="14">
-    <w:abstractNumId w:val="10"/>
-  </w:num>
-  <w:num w:numId="15">
+  <w:num w:numId="27">
     <w:abstractNumId w:val="8"/>
-  </w:num>
-  <w:num w:numId="16">
-    <w:abstractNumId w:val="14"/>
-  </w:num>
-  <w:num w:numId="17">
-    <w:abstractNumId w:val="11"/>
-  </w:num>
-  <w:num w:numId="18">
-    <w:abstractNumId w:val="7"/>
   </w:num>
 </w:numbering>
 </file>
@@ -4994,7 +6930,7 @@
 </file>
 
 <file path=customXml/itemProps1.xml><?xml version="1.0" encoding="utf-8"?>
-<ds:datastoreItem xmlns:ds="http://schemas.openxmlformats.org/officeDocument/2006/customXml" ds:itemID="{F3F4AEF2-C87C-4EC3-8629-577F81D2EBB6}">
+<ds:datastoreItem xmlns:ds="http://schemas.openxmlformats.org/officeDocument/2006/customXml" ds:itemID="{2E1787D7-3904-42BB-899F-940944FD5307}">
   <ds:schemaRefs>
     <ds:schemaRef ds:uri="http://schemas.openxmlformats.org/officeDocument/2006/bibliography"/>
   </ds:schemaRefs>

</xml_diff>